<commit_message>
Complete Crown of the Hollow Sun trilogy
All 36 chapters across Ignition, Ascension, and Eclipse (~63k words),
plus rebuilt Word books, reader JSON, and covers.
</commit_message>
<xml_diff>
--- a/public/books/Crown-of-the-Hollow-Sun-1-Ignition.docx
+++ b/public/books/Crown-of-the-Hollow-Sun-1-Ignition.docx
@@ -302,6 +302,249 @@
     </w:p>
     <w:p>
       <w:r>
+        <w:rPr>
+          <w:rFonts w:ascii="Garamond" w:hAnsi="Garamond" w:eastAsia="Garamond"/>
+          <w:b w:val="0"/>
+          <w:i w:val="0"/>
+          <w:color w:val="6A5E4E"/>
+          <w:sz w:val="20"/>
+        </w:rPr>
+        <w:t>Chapter 4</w:t>
+      </w:r>
+    </w:p>
+    <w:p>
+      <w:pPr>
+        <w:spacing w:after="200"/>
+      </w:pPr>
+      <w:r>
+        <w:rPr>
+          <w:rFonts w:ascii="Garamond" w:hAnsi="Garamond" w:eastAsia="Garamond"/>
+          <w:b w:val="0"/>
+          <w:i w:val="0"/>
+          <w:color w:val="2A241C"/>
+          <w:sz w:val="26"/>
+        </w:rPr>
+        <w:t>The Inquisitor</w:t>
+      </w:r>
+    </w:p>
+    <w:p>
+      <w:r>
+        <w:rPr>
+          <w:rFonts w:ascii="Garamond" w:hAnsi="Garamond" w:eastAsia="Garamond"/>
+          <w:b w:val="0"/>
+          <w:i w:val="0"/>
+          <w:color w:val="6A5E4E"/>
+          <w:sz w:val="20"/>
+        </w:rPr>
+        <w:t>Chapter 5</w:t>
+      </w:r>
+    </w:p>
+    <w:p>
+      <w:pPr>
+        <w:spacing w:after="200"/>
+      </w:pPr>
+      <w:r>
+        <w:rPr>
+          <w:rFonts w:ascii="Garamond" w:hAnsi="Garamond" w:eastAsia="Garamond"/>
+          <w:b w:val="0"/>
+          <w:i w:val="0"/>
+          <w:color w:val="2A241C"/>
+          <w:sz w:val="26"/>
+        </w:rPr>
+        <w:t>Cardinal of Dusk</w:t>
+      </w:r>
+    </w:p>
+    <w:p>
+      <w:r>
+        <w:rPr>
+          <w:rFonts w:ascii="Garamond" w:hAnsi="Garamond" w:eastAsia="Garamond"/>
+          <w:b w:val="0"/>
+          <w:i w:val="0"/>
+          <w:color w:val="6A5E4E"/>
+          <w:sz w:val="20"/>
+        </w:rPr>
+        <w:t>Chapter 6</w:t>
+      </w:r>
+    </w:p>
+    <w:p>
+      <w:pPr>
+        <w:spacing w:after="200"/>
+      </w:pPr>
+      <w:r>
+        <w:rPr>
+          <w:rFonts w:ascii="Garamond" w:hAnsi="Garamond" w:eastAsia="Garamond"/>
+          <w:b w:val="0"/>
+          <w:i w:val="0"/>
+          <w:color w:val="2A241C"/>
+          <w:sz w:val="26"/>
+        </w:rPr>
+        <w:t>Containment</w:t>
+      </w:r>
+    </w:p>
+    <w:p>
+      <w:r>
+        <w:rPr>
+          <w:rFonts w:ascii="Garamond" w:hAnsi="Garamond" w:eastAsia="Garamond"/>
+          <w:b w:val="0"/>
+          <w:i w:val="0"/>
+          <w:color w:val="6A5E4E"/>
+          <w:sz w:val="20"/>
+        </w:rPr>
+        <w:t>Chapter 7</w:t>
+      </w:r>
+    </w:p>
+    <w:p>
+      <w:pPr>
+        <w:spacing w:after="200"/>
+      </w:pPr>
+      <w:r>
+        <w:rPr>
+          <w:rFonts w:ascii="Garamond" w:hAnsi="Garamond" w:eastAsia="Garamond"/>
+          <w:b w:val="0"/>
+          <w:i w:val="0"/>
+          <w:color w:val="2A241C"/>
+          <w:sz w:val="26"/>
+        </w:rPr>
+        <w:t>The Prodigy</w:t>
+      </w:r>
+    </w:p>
+    <w:p>
+      <w:r>
+        <w:rPr>
+          <w:rFonts w:ascii="Garamond" w:hAnsi="Garamond" w:eastAsia="Garamond"/>
+          <w:b w:val="0"/>
+          <w:i w:val="0"/>
+          <w:color w:val="6A5E4E"/>
+          <w:sz w:val="20"/>
+        </w:rPr>
+        <w:t>Chapter 8</w:t>
+      </w:r>
+    </w:p>
+    <w:p>
+      <w:pPr>
+        <w:spacing w:after="200"/>
+      </w:pPr>
+      <w:r>
+        <w:rPr>
+          <w:rFonts w:ascii="Garamond" w:hAnsi="Garamond" w:eastAsia="Garamond"/>
+          <w:b w:val="0"/>
+          <w:i w:val="0"/>
+          <w:color w:val="2A241C"/>
+          <w:sz w:val="26"/>
+        </w:rPr>
+        <w:t>Flight from Vireth</w:t>
+      </w:r>
+    </w:p>
+    <w:p>
+      <w:r>
+        <w:rPr>
+          <w:rFonts w:ascii="Garamond" w:hAnsi="Garamond" w:eastAsia="Garamond"/>
+          <w:b w:val="0"/>
+          <w:i w:val="0"/>
+          <w:color w:val="6A5E4E"/>
+          <w:sz w:val="20"/>
+        </w:rPr>
+        <w:t>Chapter 9</w:t>
+      </w:r>
+    </w:p>
+    <w:p>
+      <w:pPr>
+        <w:spacing w:after="200"/>
+      </w:pPr>
+      <w:r>
+        <w:rPr>
+          <w:rFonts w:ascii="Garamond" w:hAnsi="Garamond" w:eastAsia="Garamond"/>
+          <w:b w:val="0"/>
+          <w:i w:val="0"/>
+          <w:color w:val="2A241C"/>
+          <w:sz w:val="26"/>
+        </w:rPr>
+        <w:t>The Nightlands</w:t>
+      </w:r>
+    </w:p>
+    <w:p>
+      <w:r>
+        <w:rPr>
+          <w:rFonts w:ascii="Garamond" w:hAnsi="Garamond" w:eastAsia="Garamond"/>
+          <w:b w:val="0"/>
+          <w:i w:val="0"/>
+          <w:color w:val="6A5E4E"/>
+          <w:sz w:val="20"/>
+        </w:rPr>
+        <w:t>Chapter 10</w:t>
+      </w:r>
+    </w:p>
+    <w:p>
+      <w:pPr>
+        <w:spacing w:after="200"/>
+      </w:pPr>
+      <w:r>
+        <w:rPr>
+          <w:rFonts w:ascii="Garamond" w:hAnsi="Garamond" w:eastAsia="Garamond"/>
+          <w:b w:val="0"/>
+          <w:i w:val="0"/>
+          <w:color w:val="2A241C"/>
+          <w:sz w:val="26"/>
+        </w:rPr>
+        <w:t>The Queen of Frost</w:t>
+      </w:r>
+    </w:p>
+    <w:p>
+      <w:r>
+        <w:rPr>
+          <w:rFonts w:ascii="Garamond" w:hAnsi="Garamond" w:eastAsia="Garamond"/>
+          <w:b w:val="0"/>
+          <w:i w:val="0"/>
+          <w:color w:val="6A5E4E"/>
+          <w:sz w:val="20"/>
+        </w:rPr>
+        <w:t>Chapter 11</w:t>
+      </w:r>
+    </w:p>
+    <w:p>
+      <w:pPr>
+        <w:spacing w:after="200"/>
+      </w:pPr>
+      <w:r>
+        <w:rPr>
+          <w:rFonts w:ascii="Garamond" w:hAnsi="Garamond" w:eastAsia="Garamond"/>
+          <w:b w:val="0"/>
+          <w:i w:val="0"/>
+          <w:color w:val="2A241C"/>
+          <w:sz w:val="26"/>
+        </w:rPr>
+        <w:t>The Dreaming Eye</w:t>
+      </w:r>
+    </w:p>
+    <w:p>
+      <w:r>
+        <w:rPr>
+          <w:rFonts w:ascii="Garamond" w:hAnsi="Garamond" w:eastAsia="Garamond"/>
+          <w:b w:val="0"/>
+          <w:i w:val="0"/>
+          <w:color w:val="6A5E4E"/>
+          <w:sz w:val="20"/>
+        </w:rPr>
+        <w:t>Chapter 12</w:t>
+      </w:r>
+    </w:p>
+    <w:p>
+      <w:pPr>
+        <w:spacing w:after="200"/>
+      </w:pPr>
+      <w:r>
+        <w:rPr>
+          <w:rFonts w:ascii="Garamond" w:hAnsi="Garamond" w:eastAsia="Garamond"/>
+          <w:b w:val="0"/>
+          <w:i w:val="0"/>
+          <w:color w:val="2A241C"/>
+          <w:sz w:val="26"/>
+        </w:rPr>
+        <w:t>Noon</w:t>
+      </w:r>
+    </w:p>
+    <w:p>
+      <w:r>
         <w:br w:type="page"/>
       </w:r>
     </w:p>
@@ -1115,6 +1358,2914 @@
           <w:sz w:val="22"/>
         </w:rPr>
         <w:t>Toma's face did the thin thing. He was fourteen and he had been afraid in the Kiln and he had been afraid in the road and he was going to do the right stupid thing if Ren let him. Ren did not let him. He put the last of the copied shield around Toma and Nima, a small even room, and he pointed them at the alley that ran to the Kiln, and he held the shield long enough that walking away from him was easier than walking toward him. "Go," he said. "If I come back and you're frozen I will be so angry." Nima held out the last dust of the bread in her palm, nothing, a gesture. He took the nothing. Then he dropped the shield before the overflow could find them, and he turned into the thawed streets with Cinder at his ruined gait, into a city that had ten warm blocks with his name already moving through them, and above the wet eaves the black disk watched like an eye that had started, just started, to dream it was open.</w:t>
+      </w:r>
+    </w:p>
+    <w:p>
+      <w:r>
+        <w:br w:type="page"/>
+      </w:r>
+    </w:p>
+    <w:p>
+      <w:pPr>
+        <w:spacing w:after="120"/>
+        <w:jc w:val="center"/>
+      </w:pPr>
+      <w:r>
+        <w:rPr>
+          <w:rFonts w:ascii="Garamond" w:hAnsi="Garamond" w:eastAsia="Garamond"/>
+          <w:b w:val="0"/>
+          <w:i w:val="0"/>
+          <w:color w:val="8A6230"/>
+          <w:sz w:val="22"/>
+        </w:rPr>
+        <w:t>CHAPTER 4</w:t>
+      </w:r>
+    </w:p>
+    <w:p>
+      <w:pPr>
+        <w:spacing w:after="440"/>
+        <w:jc w:val="center"/>
+      </w:pPr>
+      <w:r>
+        <w:rPr>
+          <w:rFonts w:ascii="Garamond" w:hAnsi="Garamond" w:eastAsia="Garamond"/>
+          <w:b w:val="0"/>
+          <w:i w:val="0"/>
+          <w:color w:val="2A241C"/>
+          <w:sz w:val="44"/>
+        </w:rPr>
+        <w:t>The Inquisitor</w:t>
+      </w:r>
+    </w:p>
+    <w:p>
+      <w:pPr>
+        <w:spacing w:line="360" w:lineRule="auto" w:after="160"/>
+        <w:ind w:firstLine="0"/>
+        <w:jc w:val="both"/>
+      </w:pPr>
+      <w:r>
+        <w:rPr>
+          <w:rFonts w:ascii="Garamond" w:hAnsi="Garamond" w:eastAsia="Garamond"/>
+          <w:b w:val="0"/>
+          <w:i w:val="0"/>
+          <w:color w:val="2A241C"/>
+          <w:sz w:val="22"/>
+        </w:rPr>
+        <w:t>The Bone Market did not thaw. That was the first wrong thing. Ten streets of Cinderrow were dripping eaves and shouting, and here the hanging ribs still wore their white, and the cutters worked in the same hunched rhythm they had worked in since the troughs froze, because bone did not care about gold in the sky. Lyra came in off the tallow-yard with both sabers still sheathed and the seals along the blades ticking against her thighs like insects. She had walked the melt-line to its edge and then past it, into the cold that had not agreed to the boy, and the market's lanes took her the way they took everyone, by the nose: marrow-smoke, old iron, the sweet rot of frostbitten offal piled for the soap-boilers. She was looking for a three-legged dog and a split in a shirt and a heat that did not belong to any well she had ever sealed.</w:t>
+      </w:r>
+    </w:p>
+    <w:p>
+      <w:pPr>
+        <w:spacing w:line="360" w:lineRule="auto" w:after="160"/>
+        <w:ind w:firstLine="403"/>
+        <w:jc w:val="both"/>
+      </w:pPr>
+      <w:r>
+        <w:rPr>
+          <w:rFonts w:ascii="Garamond" w:hAnsi="Garamond" w:eastAsia="Garamond"/>
+          <w:b w:val="0"/>
+          <w:i w:val="0"/>
+          <w:color w:val="2A241C"/>
+          <w:sz w:val="22"/>
+        </w:rPr>
+        <w:t>A cutter with peace-tied knives watched her ash-coat and did not watch her hands. She let him. The inquisitor's cut was still in the cloth even without the badge, and in the Bone Market that cut meant either a fine or a body, and he would decide which when she stopped walking. She did not stop. The seals had tasted gold at the Wellgate and they were still hungry for it, a thin ugly pull toward anything that burned too clean. She followed the pull down a lane of sheep-skulls stacked like bricks, past a woman selling knuckle-broth that had never seen a knuckle, and found the first print in the frost: a dog's three-beat gait, the stump dragging a comma of melt. Beside it, a boot she already knew. Size too large, stuffed, the left heel worn to nothing. The boy from the gate. The vessel. The thing Solenne would name when the messengers finished climbing the terraces.</w:t>
+      </w:r>
+    </w:p>
+    <w:p>
+      <w:pPr>
+        <w:spacing w:line="360" w:lineRule="auto" w:after="160"/>
+        <w:ind w:firstLine="403"/>
+        <w:jc w:val="both"/>
+      </w:pPr>
+      <w:r>
+        <w:rPr>
+          <w:rFonts w:ascii="Garamond" w:hAnsi="Garamond" w:eastAsia="Garamond"/>
+          <w:b w:val="0"/>
+          <w:i w:val="0"/>
+          <w:color w:val="2A241C"/>
+          <w:sz w:val="22"/>
+        </w:rPr>
+        <w:t>Lyra had put out lights before. That was the work. You found the thief of years, you laid the seals, you spent the Church's heat to starve the stolen heat, and then you went to Vespers and did not look at your hands. The last light had been a girl named Sera in a river city that steamed for three days after and then froze harder than before. Twelve. Lyra had held the left seal and Solenne the right, and the girl had looked at the sabers and not at the Cardinal, which was a detail Lyra kept in a drawer with the rest of the things she was not paid to feel. This one was older. Seventeen, if she was any judge of slum years, which were not the same as terrace years. He had a dog. He had shoved a boy out of a killing shot and then cooked eight men without meaning to. She told herself that the dog did not matter. The seals ticked. She went on.</w:t>
+      </w:r>
+    </w:p>
+    <w:p>
+      <w:pPr>
+        <w:spacing w:line="360" w:lineRule="auto" w:after="160"/>
+        <w:ind w:firstLine="403"/>
+        <w:jc w:val="both"/>
+      </w:pPr>
+      <w:r>
+        <w:rPr>
+          <w:rFonts w:ascii="Garamond" w:hAnsi="Garamond" w:eastAsia="Garamond"/>
+          <w:b w:val="0"/>
+          <w:i w:val="0"/>
+          <w:color w:val="2A241C"/>
+          <w:sz w:val="22"/>
+        </w:rPr>
+        <w:t xml:space="preserve">The market's inner square was a pit of packed bone-dust and a dry well that had been a shrine before the Church decided shrines needed licenses. People from the thawed streets had come in with their hands still pink, buying marrow they could suddenly taste, and the talk was already a single animal. </w:t>
+      </w:r>
+      <w:r>
+        <w:rPr>
+          <w:rFonts w:ascii="Garamond" w:hAnsi="Garamond" w:eastAsia="Garamond"/>
+          <w:b w:val="0"/>
+          <w:i/>
+          <w:color w:val="2A241C"/>
+          <w:sz w:val="22"/>
+        </w:rPr>
+        <w:t>False sun. Wellgate. The Kael boy from Cinderrow. Lit the sky.</w:t>
+      </w:r>
+      <w:r>
+        <w:rPr>
+          <w:rFonts w:ascii="Garamond" w:hAnsi="Garamond" w:eastAsia="Garamond"/>
+          <w:b w:val="0"/>
+          <w:i w:val="0"/>
+          <w:color w:val="2A241C"/>
+          <w:sz w:val="22"/>
+        </w:rPr>
+        <w:t xml:space="preserve"> She heard the name the way you hear a warrant. Ren Kael. Street, Kiln, no house, a null-brand that was supposed to make him uninteresting to frost and had apparently been a lid on a stove. She bought nothing and stood under a rack of hog-ribs and listened until the talk gave her a direction: west lanes, toward the old tannery, the dog seen drinking melt from a gutter as if melt were a miracle and not a problem.</w:t>
+      </w:r>
+    </w:p>
+    <w:p>
+      <w:pPr>
+        <w:spacing w:line="360" w:lineRule="auto" w:after="160"/>
+        <w:ind w:firstLine="403"/>
+        <w:jc w:val="both"/>
+      </w:pPr>
+      <w:r>
+        <w:rPr>
+          <w:rFonts w:ascii="Garamond" w:hAnsi="Garamond" w:eastAsia="Garamond"/>
+          <w:b w:val="0"/>
+          <w:i w:val="0"/>
+          <w:color w:val="2A241C"/>
+          <w:sz w:val="22"/>
+        </w:rPr>
+        <w:t>She found them in a cut between a glue-pot stall and a stack of ox-pelvises, the boy with his shirt stuck to the split on his ribs and the dog on three legs doing a long, careful drink from a trough that had not been liquid that morning. He looked like a theft. He looked like a tired animal. He looked, inconveniently, like a person. Lyra had the sabers out before the thought finished. The seals caught the lid-light and ate it, black script smoking at the edges, and the glue-pot woman dropped her ladle and left without dignity. "Down," Lyra said, because it had worked as a word at the gate even when it had not worked as a fact. Cinder—she had heard the name in the square, ridiculous, perfect—came up off the trough with her ruined leg tucked and her teeth showing. The boy put a hand on the dog's ruff and did not go down.</w:t>
+      </w:r>
+    </w:p>
+    <w:p>
+      <w:pPr>
+        <w:spacing w:line="360" w:lineRule="auto" w:after="160"/>
+        <w:ind w:firstLine="403"/>
+        <w:jc w:val="both"/>
+      </w:pPr>
+      <w:r>
+        <w:rPr>
+          <w:rFonts w:ascii="Garamond" w:hAnsi="Garamond" w:eastAsia="Garamond"/>
+          <w:b w:val="0"/>
+          <w:i w:val="0"/>
+          <w:color w:val="2A241C"/>
+          <w:sz w:val="22"/>
+        </w:rPr>
+        <w:t>"You're the one from the wall," he said. His voice had a slum's grit and a slum's manners, which was to say none, and a thread of gold in it that the seals heard. "The polite one. With the drawers for the screaming." He had seen her face at the gate, then. She had not thought he was seeing anything. "On your knees. Hands on the bone. The dog stays if the dog stays still." "She's not good at still," he said, and then he moved, not at her, past her, a street-rat's fake toward the tannery dark, and she cut the fake because she had been taught to cut fakes in a yard with a name and a stipend. The left saber went where his throat would be. He was not there. Heat was there instead, a shove the color of a kiln's mouth, and the seal flared and ate most of it and the rest of it threw her into the ox-pelvis stack hard enough to make the bones say a word.</w:t>
+      </w:r>
+    </w:p>
+    <w:p>
+      <w:pPr>
+        <w:spacing w:line="360" w:lineRule="auto" w:after="160"/>
+        <w:ind w:firstLine="403"/>
+        <w:jc w:val="both"/>
+      </w:pPr>
+      <w:r>
+        <w:rPr>
+          <w:rFonts w:ascii="Garamond" w:hAnsi="Garamond" w:eastAsia="Garamond"/>
+          <w:b w:val="0"/>
+          <w:i w:val="0"/>
+          <w:color w:val="2A241C"/>
+          <w:sz w:val="22"/>
+        </w:rPr>
+        <w:t>She came up tasting dust and old animal. The sabers had held. She had not. That was the failure, the simple one: she had brought the right tools to the wrong size of fire. He was in the lane, not running yet, looking at his own hands as if they had insulted him. The overflow was a halo he could not see and she could. It licked the hanging ribs and left them steaming. It wanted her seals the way a tide wants a hole in a wall. She put both blades in the primer-cross, the catch-form for vessels, the one that had held Sera long enough. The script ran from hilt to tip and made a net of hungry dark between them. She stepped in.</w:t>
+      </w:r>
+    </w:p>
+    <w:p>
+      <w:pPr>
+        <w:spacing w:line="360" w:lineRule="auto" w:after="160"/>
+        <w:ind w:firstLine="403"/>
+        <w:jc w:val="both"/>
+      </w:pPr>
+      <w:r>
+        <w:rPr>
+          <w:rFonts w:ascii="Garamond" w:hAnsi="Garamond" w:eastAsia="Garamond"/>
+          <w:b w:val="0"/>
+          <w:i w:val="0"/>
+          <w:color w:val="2A241C"/>
+          <w:sz w:val="22"/>
+        </w:rPr>
+        <w:t>The net should have closed. It had closed on five before him, or four, depending on how you counted the ones who burned themselves out before the Church arrived. It touched his chest and the split there, the broken brand, and for a breath it held, a black ring on a gold core, the work working. Then he looked at the pattern of the seals the way he had no right to look at anything, with a thief's bright attention, and the thing in him copied the hunger. She felt it. The net turned inside out. Her own sabers bit her palms. The catch-form became a door, and what came through it was not a boy. It was noon in a lane of bones. She went to one knee because the alternative was a face full of pelvis and a legend about an inquisitor who died stupid.</w:t>
+      </w:r>
+    </w:p>
+    <w:p>
+      <w:pPr>
+        <w:spacing w:line="360" w:lineRule="auto" w:after="160"/>
+        <w:ind w:firstLine="403"/>
+        <w:jc w:val="both"/>
+      </w:pPr>
+      <w:r>
+        <w:rPr>
+          <w:rFonts w:ascii="Garamond" w:hAnsi="Garamond" w:eastAsia="Garamond"/>
+          <w:b w:val="0"/>
+          <w:i w:val="0"/>
+          <w:color w:val="2A241C"/>
+          <w:sz w:val="22"/>
+        </w:rPr>
+        <w:t>He could have finished it. The purge squad had been finished without being asked. She was closer than they had been, and the gold was in her mouth, and her seals were busy eating themselves. Cinder circled in, three-beat, growling at the light as if the light were a man. Ren Kael stared at Lyra on her knee and at the sabers smoking in her hands and at the glue-pot still rocking where the woman had dropped it, and he did the thing that wrecked the warrant. He pinched. She saw him do it, jaw locked, both palms flat as if he could push a well back into a rib. The noon shrank. It did not go, but it shrank, and the lane was a lane again, steaming, ridiculous with bone. He was shaking. The dog leaned on his shin.</w:t>
+      </w:r>
+    </w:p>
+    <w:p>
+      <w:pPr>
+        <w:spacing w:line="360" w:lineRule="auto" w:after="160"/>
+        <w:ind w:firstLine="403"/>
+        <w:jc w:val="both"/>
+      </w:pPr>
+      <w:r>
+        <w:rPr>
+          <w:rFonts w:ascii="Garamond" w:hAnsi="Garamond" w:eastAsia="Garamond"/>
+          <w:b w:val="0"/>
+          <w:i w:val="0"/>
+          <w:color w:val="2A241C"/>
+          <w:sz w:val="22"/>
+        </w:rPr>
+        <w:t>"Do it," Lyra said. Her voice came out the dry professional one, which was a small victory. "If you're going to. I won't chase a mercy." He laughed, and this time no gold came with it, only breath. He looked seventeen and like he wanted a wall to put his back on. "If I was a god I'd have better manners," he said. "You're on your knees in a bone pile. It's embarrassing for both of us." He picked up the glue-pot ladle, set it on the stall as if that were the point of the hour, and whistled once, a slurred street-note. Cinder came. He went west, not fast, the three-legged engine at his heel, and he did not look back, which was either trust or the particular exhaustion of someone who had already counted his deaths for the day and was not taking on more.</w:t>
+      </w:r>
+    </w:p>
+    <w:p>
+      <w:pPr>
+        <w:spacing w:line="360" w:lineRule="auto" w:after="160"/>
+        <w:ind w:firstLine="403"/>
+        <w:jc w:val="both"/>
+      </w:pPr>
+      <w:r>
+        <w:rPr>
+          <w:rFonts w:ascii="Garamond" w:hAnsi="Garamond" w:eastAsia="Garamond"/>
+          <w:b w:val="0"/>
+          <w:i w:val="0"/>
+          <w:color w:val="2A241C"/>
+          <w:sz w:val="22"/>
+        </w:rPr>
+        <w:t>Lyra sat in the bone-dust until her palms remembered they were hers. The seals had gone dull, script cooked, a week's blessing burned out in a breath. She sheathed the sabers anyway because an unsheathed inquisitor in the Bone Market was a story, and she was already going to be a story. Around the square the talk would turn. The Kael boy had walked away from the woman with two swords. The false sun had manners. She wiped her mouth and found a grin there that she did not authorize, dry, unhelpful. Then she put it away and stood and walked the other west, the one that went up, because Rhel would be at the tannery loft if the old codes still held, and the old codes were all she had left of a badge.</w:t>
+      </w:r>
+    </w:p>
+    <w:p>
+      <w:pPr>
+        <w:spacing w:line="360" w:lineRule="auto" w:after="160"/>
+        <w:ind w:firstLine="403"/>
+        <w:jc w:val="both"/>
+      </w:pPr>
+      <w:r>
+        <w:rPr>
+          <w:rFonts w:ascii="Garamond" w:hAnsi="Garamond" w:eastAsia="Garamond"/>
+          <w:b w:val="0"/>
+          <w:i w:val="0"/>
+          <w:color w:val="2A241C"/>
+          <w:sz w:val="22"/>
+        </w:rPr>
+        <w:t>The loft smelled of hide and the cheap well-oil Rhel burned to keep his fingers working. He was older than her by a decade and loyal the way a knife is loyal, which is to say to the hand that last whetted it. Solenne's hand. He had a map of Vireth on the table with the melt-band already inked, ten streets, a wound. "You lost him," he said, not a question. Lyra hung the ash-coat on the nail and did not sit. "I engaged in the inner square. Seals took the first overflow. Catch-form failed. He's not a flare, Rhel. He's a well with feet." That much was true and therefore useful as a bed for the rest. Rhel's mouth did the small sour thing. "Direction."</w:t>
+      </w:r>
+    </w:p>
+    <w:p>
+      <w:pPr>
+        <w:spacing w:line="360" w:lineRule="auto" w:after="160"/>
+        <w:ind w:firstLine="403"/>
+        <w:jc w:val="both"/>
+      </w:pPr>
+      <w:r>
+        <w:rPr>
+          <w:rFonts w:ascii="Garamond" w:hAnsi="Garamond" w:eastAsia="Garamond"/>
+          <w:b w:val="0"/>
+          <w:i w:val="0"/>
+          <w:color w:val="2A241C"/>
+          <w:sz w:val="22"/>
+        </w:rPr>
+        <w:t xml:space="preserve">She looked at the map. West of the Bone Market was tannery, then the cistern mouths that ran toward the noble stacks, then the Wellgate again if you were stupid enough to circle. East was Cinderrow and the Kiln and the children she had seen him shove out of a shot. South was the ember-canals and the frost-edge. She put her finger on the stacks. "Up," she said. "He copied a shield in the cisterns and he's bleeding gold. He'll go where the heat already is, try to hide a fire in a fire. Send the squads to the middle terraces and the stack-yards. You'll find steam. You won't find him if he's clever, and he's clever the way rats are." The lie sat in the loft like a third person. Rhel wrote </w:t>
+      </w:r>
+      <w:r>
+        <w:rPr>
+          <w:rFonts w:ascii="Garamond" w:hAnsi="Garamond" w:eastAsia="Garamond"/>
+          <w:b w:val="0"/>
+          <w:i/>
+          <w:color w:val="2A241C"/>
+          <w:sz w:val="22"/>
+        </w:rPr>
+        <w:t>terraces</w:t>
+      </w:r>
+      <w:r>
+        <w:rPr>
+          <w:rFonts w:ascii="Garamond" w:hAnsi="Garamond" w:eastAsia="Garamond"/>
+          <w:b w:val="0"/>
+          <w:i w:val="0"/>
+          <w:color w:val="2A241C"/>
+          <w:sz w:val="22"/>
+        </w:rPr>
+        <w:t xml:space="preserve"> in a clerk's hand. He did not look at her face, which was the only reason it worked.</w:t>
+      </w:r>
+    </w:p>
+    <w:p>
+      <w:pPr>
+        <w:spacing w:line="360" w:lineRule="auto" w:after="160"/>
+        <w:ind w:firstLine="403"/>
+        <w:jc w:val="both"/>
+      </w:pPr>
+      <w:r>
+        <w:rPr>
+          <w:rFonts w:ascii="Garamond" w:hAnsi="Garamond" w:eastAsia="Garamond"/>
+          <w:b w:val="0"/>
+          <w:i w:val="0"/>
+          <w:color w:val="2A241C"/>
+          <w:sz w:val="22"/>
+        </w:rPr>
+        <w:t xml:space="preserve">"Solenne's already moving," he said. "She wants a heat-sink tithe. Civilian. A net. You will be on it." He said </w:t>
+      </w:r>
+      <w:r>
+        <w:rPr>
+          <w:rFonts w:ascii="Garamond" w:hAnsi="Garamond" w:eastAsia="Garamond"/>
+          <w:b w:val="0"/>
+          <w:i/>
+          <w:color w:val="2A241C"/>
+          <w:sz w:val="22"/>
+        </w:rPr>
+        <w:t>civilian</w:t>
+      </w:r>
+      <w:r>
+        <w:rPr>
+          <w:rFonts w:ascii="Garamond" w:hAnsi="Garamond" w:eastAsia="Garamond"/>
+          <w:b w:val="0"/>
+          <w:i w:val="0"/>
+          <w:color w:val="2A241C"/>
+          <w:sz w:val="22"/>
+        </w:rPr>
+        <w:t xml:space="preserve"> the way the Church said </w:t>
+      </w:r>
+      <w:r>
+        <w:rPr>
+          <w:rFonts w:ascii="Garamond" w:hAnsi="Garamond" w:eastAsia="Garamond"/>
+          <w:b w:val="0"/>
+          <w:i/>
+          <w:color w:val="2A241C"/>
+          <w:sz w:val="22"/>
+        </w:rPr>
+        <w:t>mercy</w:t>
+      </w:r>
+      <w:r>
+        <w:rPr>
+          <w:rFonts w:ascii="Garamond" w:hAnsi="Garamond" w:eastAsia="Garamond"/>
+          <w:b w:val="0"/>
+          <w:i w:val="0"/>
+          <w:color w:val="2A241C"/>
+          <w:sz w:val="22"/>
+        </w:rPr>
+        <w:t>, as a word that had had its guts removed. Lyra thought of the Stacks woman with the child, of the pink hands in the marrow-line, of a boy who set a ladle back on a stall because the stall had been left ugly. She thought of Sera looking at the sabers. "I'll be on it," she said. She took her coat. At the loft ladder she stopped, because stopping was the closest she would come to telling him. "Rhel. The brand on him was Church work. Someone sealed a stove and left it in a slum. When she asks whose, you can tell her I don't know." "Do you," he said. "No," she said, and that was the second lie, smaller, almost true. She went down into the Bone Market's white and the city beyond it, where a three-legged dog was leaving melt-commas in the frost, heading south, and she did not follow. Not yet. Not on their leash. The seals against her thighs were dead and her palms were raw and she had already chosen a direction she would not put on a map.</w:t>
+      </w:r>
+    </w:p>
+    <w:p>
+      <w:r>
+        <w:br w:type="page"/>
+      </w:r>
+    </w:p>
+    <w:p>
+      <w:pPr>
+        <w:spacing w:after="120"/>
+        <w:jc w:val="center"/>
+      </w:pPr>
+      <w:r>
+        <w:rPr>
+          <w:rFonts w:ascii="Garamond" w:hAnsi="Garamond" w:eastAsia="Garamond"/>
+          <w:b w:val="0"/>
+          <w:i w:val="0"/>
+          <w:color w:val="8A6230"/>
+          <w:sz w:val="22"/>
+        </w:rPr>
+        <w:t>CHAPTER 5</w:t>
+      </w:r>
+    </w:p>
+    <w:p>
+      <w:pPr>
+        <w:spacing w:after="440"/>
+        <w:jc w:val="center"/>
+      </w:pPr>
+      <w:r>
+        <w:rPr>
+          <w:rFonts w:ascii="Garamond" w:hAnsi="Garamond" w:eastAsia="Garamond"/>
+          <w:b w:val="0"/>
+          <w:i w:val="0"/>
+          <w:color w:val="2A241C"/>
+          <w:sz w:val="44"/>
+        </w:rPr>
+        <w:t>Cardinal of Dusk</w:t>
+      </w:r>
+    </w:p>
+    <w:p>
+      <w:pPr>
+        <w:spacing w:line="360" w:lineRule="auto" w:after="160"/>
+        <w:ind w:firstLine="0"/>
+        <w:jc w:val="both"/>
+      </w:pPr>
+      <w:r>
+        <w:rPr>
+          <w:rFonts w:ascii="Garamond" w:hAnsi="Garamond" w:eastAsia="Garamond"/>
+          <w:b w:val="0"/>
+          <w:i w:val="0"/>
+          <w:color w:val="2A241C"/>
+          <w:sz w:val="22"/>
+        </w:rPr>
+        <w:t>The messengers came up the terrace stairs two at a time and still arrived late. Solenne met them in the gallery above the Ember Court, walking as she listened, because standing still made a report into a sermon and she had no patience for sermons she had not written. The Wellgate sagged. Eight purge-guards were a smell. Gold had stood in the sky over Vireth long enough for the upper city to see it and invent a theology before supper. She took the last tablet from the youngest runner, scanned the melt-band inked in a shaking hand, ten streets, Cinderrow to the Stacks, and said, very mildly, "Thank you. Eat something that has heat in it. Then go down again and count the living in the band. I want numbers, not awe." The boy looked at her as if numbers were a kindness. She let him.</w:t>
+      </w:r>
+    </w:p>
+    <w:p>
+      <w:pPr>
+        <w:spacing w:line="360" w:lineRule="auto" w:after="160"/>
+        <w:ind w:firstLine="403"/>
+        <w:jc w:val="both"/>
+      </w:pPr>
+      <w:r>
+        <w:rPr>
+          <w:rFonts w:ascii="Garamond" w:hAnsi="Garamond" w:eastAsia="Garamond"/>
+          <w:b w:val="0"/>
+          <w:i w:val="0"/>
+          <w:color w:val="2A241C"/>
+          <w:sz w:val="22"/>
+        </w:rPr>
+        <w:t>Below the gallery the Court was already a nest of ash-gray and white, tithe-clerks and canon-lawyers and two bishops who had never stood in a slum long enough to freeze a heel. They wanted a name for the gold. They wanted a procession. They wanted Cassian Vale walked through the terraces with his sewn shard steaming so the faithful could remember that the Church still owned a sun, a small one, a legal one. Solenne laid the tablet on the rail and looked out over Vireth instead of at them. The Hollow Sun hung in its old place, black disk, cold light, unimpressed. The city steamed in a stripe and smoked everywhere else. "We will not process," she said. Her voice did not rise. It never needed to. "We will not name him in the psalms. We will put him out."</w:t>
+      </w:r>
+    </w:p>
+    <w:p>
+      <w:pPr>
+        <w:spacing w:line="360" w:lineRule="auto" w:after="160"/>
+        <w:ind w:firstLine="403"/>
+        <w:jc w:val="both"/>
+      </w:pPr>
+      <w:r>
+        <w:rPr>
+          <w:rFonts w:ascii="Garamond" w:hAnsi="Garamond" w:eastAsia="Garamond"/>
+          <w:b w:val="0"/>
+          <w:i w:val="0"/>
+          <w:color w:val="2A241C"/>
+          <w:sz w:val="22"/>
+        </w:rPr>
+        <w:t xml:space="preserve">Canon-lawyer Vesh, who loved a category, said </w:t>
+      </w:r>
+      <w:r>
+        <w:rPr>
+          <w:rFonts w:ascii="Garamond" w:hAnsi="Garamond" w:eastAsia="Garamond"/>
+          <w:b w:val="0"/>
+          <w:i/>
+          <w:color w:val="2A241C"/>
+          <w:sz w:val="22"/>
+        </w:rPr>
+        <w:t>vessel six</w:t>
+      </w:r>
+      <w:r>
+        <w:rPr>
+          <w:rFonts w:ascii="Garamond" w:hAnsi="Garamond" w:eastAsia="Garamond"/>
+          <w:b w:val="0"/>
+          <w:i w:val="0"/>
+          <w:color w:val="2A241C"/>
+          <w:sz w:val="22"/>
+        </w:rPr>
+        <w:t xml:space="preserve"> as if the number were a leash. Solenne did not correct him. Five had been a girl. Four had been a man with a laugh she still heard in stone stairwells. Six would be a slum boy with a broken charity-brand, if the inquisitor's loft-note was worth the hide it was written on. Ren Kael. The name had come up the stairs behind the tablets, passed mouth to mouth, already half a prayer and half a warrant. She folded her hands inside her sleeves so no one would see they were cold. "A heat-sink tithe," she said. "Civilian. Tonight. The net will be the melt-band itself. We will not chase a well through cisterns while it learns to copy our forms. We will drink it where the people already stand."</w:t>
+      </w:r>
+    </w:p>
+    <w:p>
+      <w:pPr>
+        <w:spacing w:line="360" w:lineRule="auto" w:after="160"/>
+        <w:ind w:firstLine="403"/>
+        <w:jc w:val="both"/>
+      </w:pPr>
+      <w:r>
+        <w:rPr>
+          <w:rFonts w:ascii="Garamond" w:hAnsi="Garamond" w:eastAsia="Garamond"/>
+          <w:b w:val="0"/>
+          <w:i w:val="0"/>
+          <w:color w:val="2A241C"/>
+          <w:sz w:val="22"/>
+        </w:rPr>
+        <w:t xml:space="preserve">The bishops understood the word </w:t>
+      </w:r>
+      <w:r>
+        <w:rPr>
+          <w:rFonts w:ascii="Garamond" w:hAnsi="Garamond" w:eastAsia="Garamond"/>
+          <w:b w:val="0"/>
+          <w:i/>
+          <w:color w:val="2A241C"/>
+          <w:sz w:val="22"/>
+        </w:rPr>
+        <w:t>tithe</w:t>
+      </w:r>
+      <w:r>
+        <w:rPr>
+          <w:rFonts w:ascii="Garamond" w:hAnsi="Garamond" w:eastAsia="Garamond"/>
+          <w:b w:val="0"/>
+          <w:i w:val="0"/>
+          <w:color w:val="2A241C"/>
+          <w:sz w:val="22"/>
+        </w:rPr>
+        <w:t xml:space="preserve"> and did not understand the rest, which was how bishops survived. She explained it as she would explain a ration, slowly, without ornament. Inverted shards, the spent teeth pulled from noble caskets and recut to drink instead of give. One to a household in the band. Worn at the throat or bound to the wrist. When the vessel burned, the sinks would take the overflow and take the wearer's own small heat with it, a double mercy, containment and a sermon in a single arithmetic. Some would sleep and not wake. The band would freeze harder than before. The boy, bled into a thousand small mouths, would go out like a stolen coal dropped in snow. "Managed dusk," Solenne said, and the phrase had been hers for so long it no longer tasted like anything. "No one too warm. The years belong to all of us. He is spending them in an hour."</w:t>
+      </w:r>
+    </w:p>
+    <w:p>
+      <w:pPr>
+        <w:spacing w:line="360" w:lineRule="auto" w:after="160"/>
+        <w:ind w:firstLine="403"/>
+        <w:jc w:val="both"/>
+      </w:pPr>
+      <w:r>
+        <w:rPr>
+          <w:rFonts w:ascii="Garamond" w:hAnsi="Garamond" w:eastAsia="Garamond"/>
+          <w:b w:val="0"/>
+          <w:i w:val="0"/>
+          <w:color w:val="2A241C"/>
+          <w:sz w:val="22"/>
+        </w:rPr>
+        <w:t>Vesh asked, because someone had to, about the legality of spending civilians. Solenne looked at him until he found his own answer in the doctrine of scarcity, the one the Church of the Last Ember had built its whole roof on: the god was dead, the heat was finite, a thief of years was a plague, and plagues were put out with whatever water you had. "We have used soldiers," she said. "Soldiers are civilians we paid to stand closer. I will not pretend a gauntlet makes a death holier than a wrist-cord. Write it as salvation. I will sign it as that." She did not mention that she had signed it as that before. She did not need to. The Court had a memory even when it claimed otherwise. The last two times, the tablets had been smaller and the dead had had names she would not give these men.</w:t>
+      </w:r>
+    </w:p>
+    <w:p>
+      <w:pPr>
+        <w:spacing w:line="360" w:lineRule="auto" w:after="160"/>
+        <w:ind w:firstLine="403"/>
+        <w:jc w:val="both"/>
+      </w:pPr>
+      <w:r>
+        <w:rPr>
+          <w:rFonts w:ascii="Garamond" w:hAnsi="Garamond" w:eastAsia="Garamond"/>
+          <w:b w:val="0"/>
+          <w:i w:val="0"/>
+          <w:color w:val="2A241C"/>
+          <w:sz w:val="22"/>
+        </w:rPr>
+        <w:t>Halvern had been vessel four and a problem she had loved on purpose. He had taught primer-forms in the cloister yard, patient with the stupid, cruel to the lazy, and when the famine winter came he had opened his own heat in the lower terraces until the frost receded from three fountains and children drank. The sky had not gone gold then. It had gone a color like old brass, a warning. He had known what he was. He had asked her, in a room with no witnesses, to do it herself if the Court sent anyone else. She had. She had put her hands on his chest and spent a well-shard into the seal until the brass went out of the air and his mouth. He had thanked her, which was unforgivable. She had been Cardinal within the year. Salvation, she had learned, was a word you could live inside if you kept the furniture sparse.</w:t>
+      </w:r>
+    </w:p>
+    <w:p>
+      <w:pPr>
+        <w:spacing w:line="360" w:lineRule="auto" w:after="160"/>
+        <w:ind w:firstLine="403"/>
+        <w:jc w:val="both"/>
+      </w:pPr>
+      <w:r>
+        <w:rPr>
+          <w:rFonts w:ascii="Garamond" w:hAnsi="Garamond" w:eastAsia="Garamond"/>
+          <w:b w:val="0"/>
+          <w:i w:val="0"/>
+          <w:color w:val="2A241C"/>
+          <w:sz w:val="22"/>
+        </w:rPr>
+        <w:t>Sera had been twelve and had not asked. A river city south, three days of steam, a child who cried when the seals went on and then stopped crying, which was worse. Lyra Voss had held the left. Solenne the right. Afterward Lyra had walked out of the chapel without the badge and Solenne had not called her back, because a woman who had seen the work that close was either a weapon or a wound, and the Church could use both if it did not have to name which. Two false suns. Two extinctions. The doctrine held. The dusk held. The years, such as they were, went on being divided among people who would never know the names of the ones who had tried to give them a morning. Solenne watched the melt-band from the gallery and felt nothing she was willing to call grief. Grief was a heat. She did not spend it in public.</w:t>
+      </w:r>
+    </w:p>
+    <w:p>
+      <w:pPr>
+        <w:spacing w:line="360" w:lineRule="auto" w:after="160"/>
+        <w:ind w:firstLine="403"/>
+        <w:jc w:val="both"/>
+      </w:pPr>
+      <w:r>
+        <w:rPr>
+          <w:rFonts w:ascii="Garamond" w:hAnsi="Garamond" w:eastAsia="Garamond"/>
+          <w:b w:val="0"/>
+          <w:i w:val="0"/>
+          <w:color w:val="2A241C"/>
+          <w:sz w:val="22"/>
+        </w:rPr>
+        <w:t>"Cassian will remain in the inner court," she said. "If the vessel is shown a legal sun, he may try to copy it, and I will not have the Saint's shard used as a lesson for a thief." The bishops liked that. They liked Cassian, who steamed on command and said the psalms in the right order and had had no childhood left to complicate the needle. A well-shard sewn above the heart. A puppet with a furnace in him, and the strings were doctrine, and doctrine did not dream of noon. Solenne signed the tithe at the rail, the wax a dull ember-red, and added in her own hand the names that would run the net: Rhel on the count, the remaining purge squads on the perimeter, Voss in the band itself, because a woman who had already failed once would not fail twice if she wished to keep the rest of her life. "Tonight," she said. "Before he learns another form. Go."</w:t>
+      </w:r>
+    </w:p>
+    <w:p>
+      <w:pPr>
+        <w:spacing w:line="360" w:lineRule="auto" w:after="160"/>
+        <w:ind w:firstLine="403"/>
+        <w:jc w:val="both"/>
+      </w:pPr>
+      <w:r>
+        <w:rPr>
+          <w:rFonts w:ascii="Garamond" w:hAnsi="Garamond" w:eastAsia="Garamond"/>
+          <w:b w:val="0"/>
+          <w:i w:val="0"/>
+          <w:color w:val="2A241C"/>
+          <w:sz w:val="22"/>
+        </w:rPr>
+        <w:t>They went. The gallery emptied the way a lung empties, all at once, and she was alone with the tablet and the disk in the sky. She permitted herself, because there was no one to charge her for it, a single memory of Halvern's mouth saying her name as if it were not a title. Then she put that away too. Managed dusk was not a feeling. It was a roof. You kept it up or the nightlands came in, and the frost-spirits did not tithe, and the hollow beasts did not sign tablets. A boy in Cinderrow had lit the sky and the sky had no right to be lit. She would drink him with other people's wrists if that was the cup. She turned from the rail and went to Vespers of Ash without praying, which was, in its way, the most honest hour she had left.</w:t>
+      </w:r>
+    </w:p>
+    <w:p>
+      <w:pPr>
+        <w:jc w:val="center"/>
+      </w:pPr>
+      <w:r>
+        <w:rPr>
+          <w:rFonts w:ascii="Garamond" w:hAnsi="Garamond" w:eastAsia="Garamond"/>
+          <w:b w:val="0"/>
+          <w:i w:val="0"/>
+          <w:color w:val="8A6230"/>
+          <w:sz w:val="24"/>
+        </w:rPr>
+        <w:t>⁂</w:t>
+      </w:r>
+    </w:p>
+    <w:p>
+      <w:pPr>
+        <w:spacing w:line="360" w:lineRule="auto" w:after="160"/>
+        <w:ind w:firstLine="0"/>
+        <w:jc w:val="both"/>
+      </w:pPr>
+      <w:r>
+        <w:rPr>
+          <w:rFonts w:ascii="Garamond" w:hAnsi="Garamond" w:eastAsia="Garamond"/>
+          <w:b w:val="0"/>
+          <w:i w:val="0"/>
+          <w:color w:val="2A241C"/>
+          <w:sz w:val="22"/>
+        </w:rPr>
+        <w:t>Orin Hale packed in the dark of a charity cell while the academy bells were still arguing about whether to ring for fire or for prayer. The gold had come through the practice-yard glass like a slap. He had been in the middle of Glassheart, the third-year knot, the one that had taken him three years to stop cracking, a lattice of spent heat so fine it could hold a room's warmth without a visible seam. The slap had broken his concentration and not the lattice, which would have pleased him on a different day. He folded the notes into oilcloth, put the notes into the satchel, put the satchel on the cot beside a coat that had been his father's before the repossession clerks took the rest. House Hale's last son owned a coat, a technique, and a sister-shaped hole. He did not own a well-right. Those had gone to pay a debt the size of a winter.</w:t>
+      </w:r>
+    </w:p>
+    <w:p>
+      <w:pPr>
+        <w:spacing w:line="360" w:lineRule="auto" w:after="160"/>
+        <w:ind w:firstLine="403"/>
+        <w:jc w:val="both"/>
+      </w:pPr>
+      <w:r>
+        <w:rPr>
+          <w:rFonts w:ascii="Garamond" w:hAnsi="Garamond" w:eastAsia="Garamond"/>
+          <w:b w:val="0"/>
+          <w:i w:val="0"/>
+          <w:color w:val="2A241C"/>
+          <w:sz w:val="22"/>
+        </w:rPr>
+        <w:t xml:space="preserve">Lirae had frozen in the west wing of the manse while he was here, learning to spend heat like a noble, which was to say at a desk, in theory, while the theory did not reach home. He had not been told in time. He had been told in a letter with a Church seal, </w:t>
+      </w:r>
+      <w:r>
+        <w:rPr>
+          <w:rFonts w:ascii="Garamond" w:hAnsi="Garamond" w:eastAsia="Garamond"/>
+          <w:b w:val="0"/>
+          <w:i/>
+          <w:color w:val="2A241C"/>
+          <w:sz w:val="22"/>
+        </w:rPr>
+        <w:t>regrettable, the allotment was reassigned, the years belong to all of us.</w:t>
+      </w:r>
+      <w:r>
+        <w:rPr>
+          <w:rFonts w:ascii="Garamond" w:hAnsi="Garamond" w:eastAsia="Garamond"/>
+          <w:b w:val="0"/>
+          <w:i w:val="0"/>
+          <w:color w:val="2A241C"/>
+          <w:sz w:val="22"/>
+        </w:rPr>
+        <w:t xml:space="preserve"> She had been sixteen. He had been on a bench they called charity and he called exile. The satchel buckled. He put Lirae's scarf in last, a gray strip that had lost its smell to the same cold that had taken her, and he did not pray over it because prayer was what the people with shards did to feel better about the arithmetic.</w:t>
+      </w:r>
+    </w:p>
+    <w:p>
+      <w:pPr>
+        <w:spacing w:line="360" w:lineRule="auto" w:after="160"/>
+        <w:ind w:firstLine="403"/>
+        <w:jc w:val="both"/>
+      </w:pPr>
+      <w:r>
+        <w:rPr>
+          <w:rFonts w:ascii="Garamond" w:hAnsi="Garamond" w:eastAsia="Garamond"/>
+          <w:b w:val="0"/>
+          <w:i w:val="0"/>
+          <w:color w:val="2A241C"/>
+          <w:sz w:val="22"/>
+        </w:rPr>
+        <w:t xml:space="preserve">In the corridor the other students were being counted for a tithe. He heard the word </w:t>
+      </w:r>
+      <w:r>
+        <w:rPr>
+          <w:rFonts w:ascii="Garamond" w:hAnsi="Garamond" w:eastAsia="Garamond"/>
+          <w:b w:val="0"/>
+          <w:i/>
+          <w:color w:val="2A241C"/>
+          <w:sz w:val="22"/>
+        </w:rPr>
+        <w:t>heat-sink</w:t>
+      </w:r>
+      <w:r>
+        <w:rPr>
+          <w:rFonts w:ascii="Garamond" w:hAnsi="Garamond" w:eastAsia="Garamond"/>
+          <w:b w:val="0"/>
+          <w:i w:val="0"/>
+          <w:color w:val="2A241C"/>
+          <w:sz w:val="22"/>
+        </w:rPr>
+        <w:t xml:space="preserve"> and the word </w:t>
+      </w:r>
+      <w:r>
+        <w:rPr>
+          <w:rFonts w:ascii="Garamond" w:hAnsi="Garamond" w:eastAsia="Garamond"/>
+          <w:b w:val="0"/>
+          <w:i/>
+          <w:color w:val="2A241C"/>
+          <w:sz w:val="22"/>
+        </w:rPr>
+        <w:t>civilian</w:t>
+      </w:r>
+      <w:r>
+        <w:rPr>
+          <w:rFonts w:ascii="Garamond" w:hAnsi="Garamond" w:eastAsia="Garamond"/>
+          <w:b w:val="0"/>
+          <w:i w:val="0"/>
+          <w:color w:val="2A241C"/>
+          <w:sz w:val="22"/>
+        </w:rPr>
+        <w:t xml:space="preserve"> and the word </w:t>
+      </w:r>
+      <w:r>
+        <w:rPr>
+          <w:rFonts w:ascii="Garamond" w:hAnsi="Garamond" w:eastAsia="Garamond"/>
+          <w:b w:val="0"/>
+          <w:i/>
+          <w:color w:val="2A241C"/>
+          <w:sz w:val="22"/>
+        </w:rPr>
+        <w:t>band</w:t>
+      </w:r>
+      <w:r>
+        <w:rPr>
+          <w:rFonts w:ascii="Garamond" w:hAnsi="Garamond" w:eastAsia="Garamond"/>
+          <w:b w:val="0"/>
+          <w:i w:val="0"/>
+          <w:color w:val="2A241C"/>
+          <w:sz w:val="22"/>
+        </w:rPr>
+        <w:t xml:space="preserve">, and he understood the shape of Solenne's roof without being invited under it. They would string inverted shards on the slums and wait for the boy to burn, and some clerk would write </w:t>
+      </w:r>
+      <w:r>
+        <w:rPr>
+          <w:rFonts w:ascii="Garamond" w:hAnsi="Garamond" w:eastAsia="Garamond"/>
+          <w:b w:val="0"/>
+          <w:i/>
+          <w:color w:val="2A241C"/>
+          <w:sz w:val="22"/>
+        </w:rPr>
+        <w:t>contained</w:t>
+      </w:r>
+      <w:r>
+        <w:rPr>
+          <w:rFonts w:ascii="Garamond" w:hAnsi="Garamond" w:eastAsia="Garamond"/>
+          <w:b w:val="0"/>
+          <w:i w:val="0"/>
+          <w:color w:val="2A241C"/>
+          <w:sz w:val="22"/>
+        </w:rPr>
+        <w:t xml:space="preserve"> and some bishop would write </w:t>
+      </w:r>
+      <w:r>
+        <w:rPr>
+          <w:rFonts w:ascii="Garamond" w:hAnsi="Garamond" w:eastAsia="Garamond"/>
+          <w:b w:val="0"/>
+          <w:i/>
+          <w:color w:val="2A241C"/>
+          <w:sz w:val="22"/>
+        </w:rPr>
+        <w:t>mercy</w:t>
+      </w:r>
+      <w:r>
+        <w:rPr>
+          <w:rFonts w:ascii="Garamond" w:hAnsi="Garamond" w:eastAsia="Garamond"/>
+          <w:b w:val="0"/>
+          <w:i w:val="0"/>
+          <w:color w:val="2A241C"/>
+          <w:sz w:val="22"/>
+        </w:rPr>
+        <w:t>, and the gold would go out of the world the way Lirae had gone out of a room. Orin slung the satchel. He was nineteen and a prodigy and fallen, which made him either a tool or a problem, and he had no intention of standing in a yard with a sink at his throat while a living well walked around being badly taught by panic.</w:t>
+      </w:r>
+    </w:p>
+    <w:p>
+      <w:pPr>
+        <w:spacing w:line="360" w:lineRule="auto" w:after="160"/>
+        <w:ind w:firstLine="403"/>
+        <w:jc w:val="both"/>
+      </w:pPr>
+      <w:r>
+        <w:rPr>
+          <w:rFonts w:ascii="Garamond" w:hAnsi="Garamond" w:eastAsia="Garamond"/>
+          <w:b w:val="0"/>
+          <w:i w:val="0"/>
+          <w:color w:val="2A241C"/>
+          <w:sz w:val="22"/>
+        </w:rPr>
+        <w:t>He went down the academy's back stair, the one that smelled of old well-oil and failure, and out into the terrace wind. The Hollow Sun looked the same. The stripe of melt down in the slums did not. He could feel it even from here, a wrongness in the budget of the city, a heat that did not debit. His fingers itched for a form to put it in. Glassheart, or something Glassheart wanted to become. If the boy could copy a shield in a cistern, he could be shown a lattice. If he could be shown a lattice, he might not have to die on other people's wrists. Orin knew that was a story he was telling to make the leaving feel like honor. He did not care. He turned his face toward the old Hale manse on the frost-edge of the middle city, where the well-rights were gone and the walls still stood, and he started walking, satchel knocking his hip, the gold's afterimage still printed on the inside of his eyes like a door he intended to open.</w:t>
+      </w:r>
+    </w:p>
+    <w:p>
+      <w:r>
+        <w:br w:type="page"/>
+      </w:r>
+    </w:p>
+    <w:p>
+      <w:pPr>
+        <w:spacing w:after="120"/>
+        <w:jc w:val="center"/>
+      </w:pPr>
+      <w:r>
+        <w:rPr>
+          <w:rFonts w:ascii="Garamond" w:hAnsi="Garamond" w:eastAsia="Garamond"/>
+          <w:b w:val="0"/>
+          <w:i w:val="0"/>
+          <w:color w:val="8A6230"/>
+          <w:sz w:val="22"/>
+        </w:rPr>
+        <w:t>CHAPTER 6</w:t>
+      </w:r>
+    </w:p>
+    <w:p>
+      <w:pPr>
+        <w:spacing w:after="440"/>
+        <w:jc w:val="center"/>
+      </w:pPr>
+      <w:r>
+        <w:rPr>
+          <w:rFonts w:ascii="Garamond" w:hAnsi="Garamond" w:eastAsia="Garamond"/>
+          <w:b w:val="0"/>
+          <w:i w:val="0"/>
+          <w:color w:val="2A241C"/>
+          <w:sz w:val="44"/>
+        </w:rPr>
+        <w:t>Containment</w:t>
+      </w:r>
+    </w:p>
+    <w:p>
+      <w:pPr>
+        <w:spacing w:line="360" w:lineRule="auto" w:after="160"/>
+        <w:ind w:firstLine="0"/>
+        <w:jc w:val="both"/>
+      </w:pPr>
+      <w:r>
+        <w:rPr>
+          <w:rFonts w:ascii="Garamond" w:hAnsi="Garamond" w:eastAsia="Garamond"/>
+          <w:b w:val="0"/>
+          <w:i w:val="0"/>
+          <w:color w:val="2A241C"/>
+          <w:sz w:val="22"/>
+        </w:rPr>
+        <w:t xml:space="preserve">The tithe bells found Ren in a tannery lane with his back to a vat and Cinder's head under his hand, which was not hiding so much as refusing to be a spectacle. The bells were the wrong ones, not Vespers, not the cold-hour mark Nima kept on the Kiln wall. These had a flat, administrative voice. Churchmen came behind them with sacks that clinked like bad teeth. He watched, because running would have been a motion the lane would remember, while they fitted the inner streets of the melt-band with cords. Dark iron. A shard-tooth bound at each wrist, recut, the well-side inward, made to drink. A woman from the Stacks—not the one with the child, another, the same face the frost made of everyone—asked what she had done. The clerk said </w:t>
+      </w:r>
+      <w:r>
+        <w:rPr>
+          <w:rFonts w:ascii="Garamond" w:hAnsi="Garamond" w:eastAsia="Garamond"/>
+          <w:b w:val="0"/>
+          <w:i/>
+          <w:color w:val="2A241C"/>
+          <w:sz w:val="22"/>
+        </w:rPr>
+        <w:t>salvation</w:t>
+      </w:r>
+      <w:r>
+        <w:rPr>
+          <w:rFonts w:ascii="Garamond" w:hAnsi="Garamond" w:eastAsia="Garamond"/>
+          <w:b w:val="0"/>
+          <w:i w:val="0"/>
+          <w:color w:val="2A241C"/>
+          <w:sz w:val="22"/>
+        </w:rPr>
+        <w:t xml:space="preserve"> without looking up and moved to the next door.</w:t>
+      </w:r>
+    </w:p>
+    <w:p>
+      <w:pPr>
+        <w:spacing w:line="360" w:lineRule="auto" w:after="160"/>
+        <w:ind w:firstLine="403"/>
+        <w:jc w:val="both"/>
+      </w:pPr>
+      <w:r>
+        <w:rPr>
+          <w:rFonts w:ascii="Garamond" w:hAnsi="Garamond" w:eastAsia="Garamond"/>
+          <w:b w:val="0"/>
+          <w:i w:val="0"/>
+          <w:color w:val="2A241C"/>
+          <w:sz w:val="22"/>
+        </w:rPr>
+        <w:t>Ren understood the shape of it the way he understood a snare: the meat was the people, the wire was the iron, and he was the thing it wanted to close on. Cinder growled at the clink, low, the stump tucked so she could launch if launching became the kind of idea that kept you alive. He put his mouth against her ear and told her no, which she took as a suggestion. The split on his ribs ticked at the inverted shards the way it had ticked at the Wellgate, hungry and offended both. He should have gone south then, out of the band, into the Bone Market's white and the canals beyond. He knew it. He watched a boy Nima's age hold out his wrist because an adult had told him to, and the knowing went sour and useless.</w:t>
+      </w:r>
+    </w:p>
+    <w:p>
+      <w:pPr>
+        <w:spacing w:line="360" w:lineRule="auto" w:after="160"/>
+        <w:ind w:firstLine="403"/>
+        <w:jc w:val="both"/>
+      </w:pPr>
+      <w:r>
+        <w:rPr>
+          <w:rFonts w:ascii="Garamond" w:hAnsi="Garamond" w:eastAsia="Garamond"/>
+          <w:b w:val="0"/>
+          <w:i w:val="0"/>
+          <w:color w:val="2A241C"/>
+          <w:sz w:val="22"/>
+        </w:rPr>
+        <w:t>They sprung the net at the next bell. No speech. The clerks stepped back as if from a lit fuse, and the iron teeth did what they had been recut to do. They drank. First the leftover melt, the ten streets of dripping eaves going to rime in a breath, a cruelty so neat it looked like weather. Then the small heat in the bodies. The Stacks woman sat down in her own doorway without deciding to. The boy Nima's age made a sound that was not a word. Along the lane the cords frosted from the shard to the skin, and the skin went the dull yellow Ren knew from fingertips, and the thing in his chest leaned toward all of it, toward the drinking, as if it could fill a thousand mouths and still not notice the spend.</w:t>
+      </w:r>
+    </w:p>
+    <w:p>
+      <w:pPr>
+        <w:spacing w:line="360" w:lineRule="auto" w:after="160"/>
+        <w:ind w:firstLine="403"/>
+        <w:jc w:val="both"/>
+      </w:pPr>
+      <w:r>
+        <w:rPr>
+          <w:rFonts w:ascii="Garamond" w:hAnsi="Garamond" w:eastAsia="Garamond"/>
+          <w:b w:val="0"/>
+          <w:i w:val="0"/>
+          <w:color w:val="2A241C"/>
+          <w:sz w:val="22"/>
+        </w:rPr>
+        <w:t>He ran toward them. It was not a decision with steps. It was the same size of stupid he had used on the white bar at the Wellgate, the only size he had. Cinder came because Cinder came. A clerk shouted a form-code, and a purge-gauntlet went up at the lane's mouth, and Ren did not swerve. He hit the first corded wrist with both hands and tried to give the woman back what the tooth was taking, a crumb, a pulse, anything. The inverted shard took that too, greedy, a little black mouth, and her lips went blue while he watched. "Let go," someone screamed, maybe him. He could not let go. The split opened wider. The heat-shadow under his skin found the whole ring of teeth, street to street, a net laid on the melt-band like a snare on a path, and it understood the pattern the way it had understood the shield. He thought, very clearly, of Nima's yellow fingertips and the eleven marks on the Kiln wall and Toma saying they should stand in the road, and then he stopped thinking in names because names would have made him careful.</w:t>
+      </w:r>
+    </w:p>
+    <w:p>
+      <w:pPr>
+        <w:spacing w:line="360" w:lineRule="auto" w:after="160"/>
+        <w:ind w:firstLine="403"/>
+        <w:jc w:val="both"/>
+      </w:pPr>
+      <w:r>
+        <w:rPr>
+          <w:rFonts w:ascii="Garamond" w:hAnsi="Garamond" w:eastAsia="Garamond"/>
+          <w:b w:val="0"/>
+          <w:i w:val="0"/>
+          <w:color w:val="2A241C"/>
+          <w:sz w:val="22"/>
+        </w:rPr>
+        <w:t>So he lit it. He did not have another verb. He pushed the well into the mouths until the mouths could not swallow, a flood into a thousand small throats, and the inverted shards went from black to a color that hurt to see, gold at the core, white at the edge, and then they burst. Iron teeth became sparks. Cords burned off wrists and left raw rings. The Stacks woman dragged a breath like a stolen thing. The boy fell over and cried, which was better than the other quiet. Along ten streets the net became a single ugly circlet of light, a halo laid on the slums, and the clerks ran, and the purge-gauntlets at the mouths spent their sheets into a gold that ate the sheets and kept standing. People came out of doorways with their hands up, not in surrender, in the old slum reflex of checking whether the air could be touched. A man laughed and then sat down hard, as if laughter had weight. Ren was on his knees in the tannery lane with his palms cooked and Cinder barking at the light as if they had not already tried that.</w:t>
+      </w:r>
+    </w:p>
+    <w:p>
+      <w:pPr>
+        <w:spacing w:line="360" w:lineRule="auto" w:after="160"/>
+        <w:ind w:firstLine="403"/>
+        <w:jc w:val="both"/>
+      </w:pPr>
+      <w:r>
+        <w:rPr>
+          <w:rFonts w:ascii="Garamond" w:hAnsi="Garamond" w:eastAsia="Garamond"/>
+          <w:b w:val="0"/>
+          <w:i w:val="0"/>
+          <w:color w:val="2A241C"/>
+          <w:sz w:val="22"/>
+        </w:rPr>
+        <w:t>He could not pinch it this time. The burst had been too even, too copied, the net's own pattern used against itself, and the overflow had somewhere to go now: out, up, into the rime, into the people, into the sky that had no right. He felt the Hollow Sun the way you feel a stare. The black disk was a lid and also an eye and also a mouth, and the thing in his ribs reached for it without his permission, a greeting, a hunger to be seen by something that had been a sun. He folded over the dog and told her to move and she would not, and the lane filled with steam and shouting and the particular silence of Churchmen rewriting a plan.</w:t>
+      </w:r>
+    </w:p>
+    <w:p>
+      <w:pPr>
+        <w:spacing w:line="360" w:lineRule="auto" w:after="160"/>
+        <w:ind w:firstLine="403"/>
+        <w:jc w:val="both"/>
+      </w:pPr>
+      <w:r>
+        <w:rPr>
+          <w:rFonts w:ascii="Garamond" w:hAnsi="Garamond" w:eastAsia="Garamond"/>
+          <w:b w:val="0"/>
+          <w:i w:val="0"/>
+          <w:color w:val="2A241C"/>
+          <w:sz w:val="22"/>
+        </w:rPr>
+        <w:t>A woman with a raw ring on her wrist crawled to him and stopped an arm short, as if the last yard were a border. She did not thank him. She looked at the gold coming off his mouth and at the dog and at the clerks on their faces in the rime, and she said, "Don't stay," which was the first sensible instruction anyone had offered him since the crumb. He tried to say he knew. The knowing was in his cooked palms and not in his head. Cinder licked his jaw, once, rude, and the gold thinned a fraction, as if the dog were a valve he had not thought to ask.</w:t>
+      </w:r>
+    </w:p>
+    <w:p>
+      <w:pPr>
+        <w:jc w:val="center"/>
+      </w:pPr>
+      <w:r>
+        <w:rPr>
+          <w:rFonts w:ascii="Garamond" w:hAnsi="Garamond" w:eastAsia="Garamond"/>
+          <w:b w:val="0"/>
+          <w:i w:val="0"/>
+          <w:color w:val="8A6230"/>
+          <w:sz w:val="24"/>
+        </w:rPr>
+        <w:t>⁂</w:t>
+      </w:r>
+    </w:p>
+    <w:p>
+      <w:pPr>
+        <w:spacing w:line="360" w:lineRule="auto" w:after="160"/>
+        <w:ind w:firstLine="0"/>
+        <w:jc w:val="both"/>
+      </w:pPr>
+      <w:r>
+        <w:rPr>
+          <w:rFonts w:ascii="Garamond" w:hAnsi="Garamond" w:eastAsia="Garamond"/>
+          <w:b w:val="0"/>
+          <w:i w:val="0"/>
+          <w:color w:val="2A241C"/>
+          <w:sz w:val="22"/>
+        </w:rPr>
+        <w:t xml:space="preserve">Lyra was on the south perimeter with her cooked seals and a fresh pair issued at dusk, which was how you knew the Court thought she might still be useful. She felt the net light before she saw it. The seals screamed. The melt-band, which had gone to rime a minute ago, went gold in a ring so clean it might have been drawn with a compass and a god. Rhel's voice in the horn said </w:t>
+      </w:r>
+      <w:r>
+        <w:rPr>
+          <w:rFonts w:ascii="Garamond" w:hAnsi="Garamond" w:eastAsia="Garamond"/>
+          <w:b w:val="0"/>
+          <w:i/>
+          <w:color w:val="2A241C"/>
+          <w:sz w:val="22"/>
+        </w:rPr>
+        <w:t>hold catch-form, vessel is bled, wait for the quiet.</w:t>
+      </w:r>
+      <w:r>
+        <w:rPr>
+          <w:rFonts w:ascii="Garamond" w:hAnsi="Garamond" w:eastAsia="Garamond"/>
+          <w:b w:val="0"/>
+          <w:i w:val="0"/>
+          <w:color w:val="2A241C"/>
+          <w:sz w:val="22"/>
+        </w:rPr>
+        <w:t xml:space="preserve"> There was no quiet. There was a boy on his knees in a tannery lane doing the opposite of bleeding, and civilians on their backs gasping, and inverted shards in pieces like black teeth spat out of a mouth that had bitten too large.</w:t>
+      </w:r>
+    </w:p>
+    <w:p>
+      <w:pPr>
+        <w:spacing w:line="360" w:lineRule="auto" w:after="160"/>
+        <w:ind w:firstLine="403"/>
+        <w:jc w:val="both"/>
+      </w:pPr>
+      <w:r>
+        <w:rPr>
+          <w:rFonts w:ascii="Garamond" w:hAnsi="Garamond" w:eastAsia="Garamond"/>
+          <w:b w:val="0"/>
+          <w:i w:val="0"/>
+          <w:color w:val="2A241C"/>
+          <w:sz w:val="22"/>
+        </w:rPr>
+        <w:t xml:space="preserve">She should have closed. That was the work. The fresh seals were a week's blessing, hungry, ready for a black ring on a gold core. She saw him instead: not the vessel, the idiot. He had run toward the dying. Sera had not been given the chance to run either way. Sera had stood in a chapel and looked at sabers. This one had put his cooked palms on a stranger's wrist and tried to give, and the Church had called that a snare, and the snare was on fire, and Rhel was still saying </w:t>
+      </w:r>
+      <w:r>
+        <w:rPr>
+          <w:rFonts w:ascii="Garamond" w:hAnsi="Garamond" w:eastAsia="Garamond"/>
+          <w:b w:val="0"/>
+          <w:i/>
+          <w:color w:val="2A241C"/>
+          <w:sz w:val="22"/>
+        </w:rPr>
+        <w:t>hold</w:t>
+      </w:r>
+      <w:r>
+        <w:rPr>
+          <w:rFonts w:ascii="Garamond" w:hAnsi="Garamond" w:eastAsia="Garamond"/>
+          <w:b w:val="0"/>
+          <w:i w:val="0"/>
+          <w:color w:val="2A241C"/>
+          <w:sz w:val="22"/>
+        </w:rPr>
+        <w:t xml:space="preserve"> as if holding were a moral category. Lyra dropped the catch-form. The sabers came down from the primer-cross into a low guard that was for living people with gauntlets, not for a boy and a dog. She went in.</w:t>
+      </w:r>
+    </w:p>
+    <w:p>
+      <w:pPr>
+        <w:spacing w:line="360" w:lineRule="auto" w:after="160"/>
+        <w:ind w:firstLine="403"/>
+        <w:jc w:val="both"/>
+      </w:pPr>
+      <w:r>
+        <w:rPr>
+          <w:rFonts w:ascii="Garamond" w:hAnsi="Garamond" w:eastAsia="Garamond"/>
+          <w:b w:val="0"/>
+          <w:i w:val="0"/>
+          <w:color w:val="2A241C"/>
+          <w:sz w:val="22"/>
+        </w:rPr>
+        <w:t>A purge-pair at the lane mouth tried to spend a sheet across her chest, because a woman walking the wrong direction in an inquisitor's cut was a problem with a simple solution. She cut the sheet. The seals ate it and spat smoke and she did not break stride, which was a trick you learned when you were tired of dying for other people's tablets. Rhel's horn changed pitch. She would be a name on a warrant before the hour was out. Fine. Warrants were paper. The boy was going to cook himself into the disk if someone did not put a hand on him and pull. She put a hand on him. His shoulder was too hot to be kind, and she was not kind. She hauled.</w:t>
+      </w:r>
+    </w:p>
+    <w:p>
+      <w:pPr>
+        <w:spacing w:line="360" w:lineRule="auto" w:after="160"/>
+        <w:ind w:firstLine="403"/>
+        <w:jc w:val="both"/>
+      </w:pPr>
+      <w:r>
+        <w:rPr>
+          <w:rFonts w:ascii="Garamond" w:hAnsi="Garamond" w:eastAsia="Garamond"/>
+          <w:b w:val="0"/>
+          <w:i w:val="0"/>
+          <w:color w:val="2A241C"/>
+          <w:sz w:val="22"/>
+        </w:rPr>
+        <w:t>"Move," she said. "If you sit here you become a chapel. I have seen the chapel. You would hate the decorations." He looked at her with eyes that had too much gold in the white and too little sense. Cinder bit Lyra's coat, found it was not an enemy's throat, and let go in disgust. "You're the drawers," he said, which would have been funny if the sky had not been trying to remember sunrise. "I'm the exit," Lyra said. "South. Canals. If you light anything else I will hit you with the flat, and the flat is not a mercy." She got him up. He was heavier than he looked, or the heat was. The dog took point as if she had been promoted. Behind them the ring burned and the clerks counted the gasping and a Cardinal in a gallery would be folding her hands inside her sleeves and rewriting dusk.</w:t>
+      </w:r>
+    </w:p>
+    <w:p>
+      <w:pPr>
+        <w:spacing w:line="360" w:lineRule="auto" w:after="160"/>
+        <w:ind w:firstLine="403"/>
+        <w:jc w:val="both"/>
+      </w:pPr>
+      <w:r>
+        <w:rPr>
+          <w:rFonts w:ascii="Garamond" w:hAnsi="Garamond" w:eastAsia="Garamond"/>
+          <w:b w:val="0"/>
+          <w:i w:val="0"/>
+          <w:color w:val="2A241C"/>
+          <w:sz w:val="22"/>
+        </w:rPr>
+        <w:t>The woman with the raw wrist watched them go and did not raise a shout. That, too, was a kind of warrant, the slum kind, the one that said a boy had been here and a woman in an inquisitor's cut had taken him south and no one in the lane had seen a thing. Lyra filed it. She had been on the other side of that silence for years.</w:t>
+      </w:r>
+    </w:p>
+    <w:p>
+      <w:pPr>
+        <w:spacing w:line="360" w:lineRule="auto" w:after="160"/>
+        <w:ind w:firstLine="403"/>
+        <w:jc w:val="both"/>
+      </w:pPr>
+      <w:r>
+        <w:rPr>
+          <w:rFonts w:ascii="Garamond" w:hAnsi="Garamond" w:eastAsia="Garamond"/>
+          <w:b w:val="0"/>
+          <w:i w:val="0"/>
+          <w:color w:val="2A241C"/>
+          <w:sz w:val="22"/>
+        </w:rPr>
+        <w:t>They went through the tannery dark and the unthawed Bone Market and the first stink of the ember-canals, her ash-coat open, his shirt stuck to a split that ticked like a second clock. She did not ask him if he understood what he had done to the net. She understood it well enough for both of them. He had copied a snare and made it a lamp. He had saved a band and signed a thousand new warrants with the same motion. Solenne would not manage this. Solenne would come down the terraces herself if the tablets kept arriving late. A horn started behind them and stopped, which meant Rhel had found the empty catch-form and the missing woman and was doing the math that ended in her name. Lyra kept her hand on the boy's arm anyway, a grip that could be a capture if anyone asked, and was not. The seals against her thighs were live again, ticking toward him, and she let them tick. A leash could run either way if you were willing to be the thing on the floor. She was, tonight. She had already been, in a loft, with a finger on the wrong part of a map. The rest was only walking faster than the horn, and not looking up at the disk, and not asking the dog for permission to come along, because the dog had already decided, and the dog, infuriatingly, had been right at the gate and right in the bones and was right now, three-beating toward the canals as if canals were a country you could emigrate to if you were tired enough of chapels.</w:t>
+      </w:r>
+    </w:p>
+    <w:p>
+      <w:r>
+        <w:br w:type="page"/>
+      </w:r>
+    </w:p>
+    <w:p>
+      <w:pPr>
+        <w:spacing w:after="120"/>
+        <w:jc w:val="center"/>
+      </w:pPr>
+      <w:r>
+        <w:rPr>
+          <w:rFonts w:ascii="Garamond" w:hAnsi="Garamond" w:eastAsia="Garamond"/>
+          <w:b w:val="0"/>
+          <w:i w:val="0"/>
+          <w:color w:val="8A6230"/>
+          <w:sz w:val="22"/>
+        </w:rPr>
+        <w:t>CHAPTER 7</w:t>
+      </w:r>
+    </w:p>
+    <w:p>
+      <w:pPr>
+        <w:spacing w:after="440"/>
+        <w:jc w:val="center"/>
+      </w:pPr>
+      <w:r>
+        <w:rPr>
+          <w:rFonts w:ascii="Garamond" w:hAnsi="Garamond" w:eastAsia="Garamond"/>
+          <w:b w:val="0"/>
+          <w:i w:val="0"/>
+          <w:color w:val="2A241C"/>
+          <w:sz w:val="44"/>
+        </w:rPr>
+        <w:t>The Prodigy</w:t>
+      </w:r>
+    </w:p>
+    <w:p>
+      <w:pPr>
+        <w:spacing w:line="360" w:lineRule="auto" w:after="160"/>
+        <w:ind w:firstLine="0"/>
+        <w:jc w:val="both"/>
+      </w:pPr>
+      <w:r>
+        <w:rPr>
+          <w:rFonts w:ascii="Garamond" w:hAnsi="Garamond" w:eastAsia="Garamond"/>
+          <w:b w:val="0"/>
+          <w:i w:val="0"/>
+          <w:color w:val="2A241C"/>
+          <w:sz w:val="22"/>
+        </w:rPr>
+        <w:t>The manse took Orin in by the servants' stair because the front doors had been sealed with Church wax and a notice about well-rights in arrears, and he was not going to bleed his last heat on a lock that had already decided against him. He came up through the cold kitchens with the satchel knocking his hip and Lirae's scarf in his fist like a stupid flag, and the west wing met him with the smell he had been trying not to remember: old frost, closed rooms, the sweet dust of a house that had stopped being argued over. He did not go to her door. He put the scarf in the satchel so he would not stand in a corridor making a scene for an audience of frost, and he went to the practice hall instead, where the floor still had the scorch-circles of his first failed lattices, three years of cracks in a line like a child's counting.</w:t>
+      </w:r>
+    </w:p>
+    <w:p>
+      <w:pPr>
+        <w:spacing w:line="360" w:lineRule="auto" w:after="160"/>
+        <w:ind w:firstLine="403"/>
+        <w:jc w:val="both"/>
+      </w:pPr>
+      <w:r>
+        <w:rPr>
+          <w:rFonts w:ascii="Garamond" w:hAnsi="Garamond" w:eastAsia="Garamond"/>
+          <w:b w:val="0"/>
+          <w:i w:val="0"/>
+          <w:color w:val="2A241C"/>
+          <w:sz w:val="22"/>
+        </w:rPr>
+        <w:t>The net-light had hit the hall's high windows a half hour before he arrived, a gold ring laid on the slums so clean he had seen the compass in it from the terrace road. Someone had copied a snare and turned it inside out. The boy. It had to be the boy. Orin laid his coat on the rail and built Glassheart in the doorway because a prodigy who did not ward his own empty house was only a clerk with better posture. The lattice came the way it always came now, after three years of cracking: a seam-fine mesh of spent heat, no visible dome, a room's warmth held in a geometry you could miss if you were looking for fire. It had taken him a winter to make it hold a cup. Another winter to make it hold a bed. The third to make it hold a hall without a tremble at the joins. He set it, checked the debit, found it acceptable, and stood in his father's scorch-circles with his hands out, waiting for a vessel to walk into a problem he understood.</w:t>
+      </w:r>
+    </w:p>
+    <w:p>
+      <w:pPr>
+        <w:spacing w:line="360" w:lineRule="auto" w:after="160"/>
+        <w:ind w:firstLine="403"/>
+        <w:jc w:val="both"/>
+      </w:pPr>
+      <w:r>
+        <w:rPr>
+          <w:rFonts w:ascii="Garamond" w:hAnsi="Garamond" w:eastAsia="Garamond"/>
+          <w:b w:val="0"/>
+          <w:i w:val="0"/>
+          <w:color w:val="2A241C"/>
+          <w:sz w:val="22"/>
+        </w:rPr>
+        <w:t>They did not knock. The woman with two sabers came through the kitchen dark first, seals ticking, ash-coat open, inquisitor's cut and no badge, which was a story Orin had heard in the academy as a warning and not as a person. Behind her the boy, shirt stuck to his ribs, gold still ghosting the edges of him, and a three-legged dog that entered as if the manse had been built for dogs. The lattice took their heat-signature and rang, a high thin note only a calorancer would hear. The woman heard it anyway. She had the sabers in a low guard before the note finished. "Hale," she said, reading the scorch, the rail, the coat, the face. "Fallen. Prodigy. You should be on a tithe-line with a sink at your throat." "I packed," Orin said. It was not a good answer. It was the true one. The boy looked at the doorway as if the doorway were a trick, which, to be fair, it was.</w:t>
+      </w:r>
+    </w:p>
+    <w:p>
+      <w:pPr>
+        <w:spacing w:line="360" w:lineRule="auto" w:after="160"/>
+        <w:ind w:firstLine="403"/>
+        <w:jc w:val="both"/>
+      </w:pPr>
+      <w:r>
+        <w:rPr>
+          <w:rFonts w:ascii="Garamond" w:hAnsi="Garamond" w:eastAsia="Garamond"/>
+          <w:b w:val="0"/>
+          <w:i w:val="0"/>
+          <w:color w:val="2A241C"/>
+          <w:sz w:val="22"/>
+        </w:rPr>
+        <w:t>Cinder sat on the boy's foot and yawned, which did more to wreck Orin's stance than the sabers. You could not hold a tragic ward against a yawn. "You're the one who lit the ring," Orin said, because naming the work was easier than naming the person. "You copied an inverted-shard net and overfed it. That's not primer. That's not even canon. That's theft with taste." The boy—Ren, the slums had said, Kael, no house—rubbed his cooked palms on his trousers and left gold streaks that faded as he watched them, irritated. "If I was stealing I'd have taken food," he said. "This thing doesn't ask. Your door is humming at me. Make it stop." "It's holding you in," Orin said. "It's holding the hall at a temperature that will not cook the plaster. You're welcome." Lyra's mouth did a dry almost-grin. "He built a cage and said please. I like him already. Drop it, Hale. We need the canals, not a lesson."</w:t>
+      </w:r>
+    </w:p>
+    <w:p>
+      <w:pPr>
+        <w:spacing w:line="360" w:lineRule="auto" w:after="160"/>
+        <w:ind w:firstLine="403"/>
+        <w:jc w:val="both"/>
+      </w:pPr>
+      <w:r>
+        <w:rPr>
+          <w:rFonts w:ascii="Garamond" w:hAnsi="Garamond" w:eastAsia="Garamond"/>
+          <w:b w:val="0"/>
+          <w:i w:val="0"/>
+          <w:color w:val="2A241C"/>
+          <w:sz w:val="22"/>
+        </w:rPr>
+        <w:t>Orin did not drop it. He had walked out of an academy that was stringing sinks on students, and he had come to an empty house, and he was not going to be a hallway they passed through on the way to a better idea. The gold at the boy's edges was climbing. The split on his ribs ticked in a rhythm that made Glassheart's joins itch. If that overflow hit the west wing it would thaw Lirae's room and then freeze it dirtier, and Orin found that he could not bear a second weather in that doorway. "Show me you can do anything on purpose," he said. "The ring was a panic. The sky was a panic. I spent three years on this lattice. If you're a well with feet, put a shape on it. Otherwise you're only a fire the Church is right to put out."</w:t>
+      </w:r>
+    </w:p>
+    <w:p>
+      <w:pPr>
+        <w:spacing w:line="360" w:lineRule="auto" w:after="160"/>
+        <w:ind w:firstLine="403"/>
+        <w:jc w:val="both"/>
+      </w:pPr>
+      <w:r>
+        <w:rPr>
+          <w:rFonts w:ascii="Garamond" w:hAnsi="Garamond" w:eastAsia="Garamond"/>
+          <w:b w:val="0"/>
+          <w:i w:val="0"/>
+          <w:color w:val="2A241C"/>
+          <w:sz w:val="22"/>
+        </w:rPr>
+        <w:t>He regretted the last sentence as it left. It sounded like Vesh. It sounded like a tablet. Ren looked at him the way the dog had looked at Lyra's coat, inventory, teeth optional. Then he looked at the doorway, at Glassheart, at the seam-fine mesh Orin was proud of in the private, shameful way you were proud of a scar that had taken skill. The thief's attention from the reports was real. Orin felt it walk the lattice join by join, a hand along a wall, finding the debit, finding the tremble he had trained himself not to see. Ten seconds. He knew it was ten because he counted, because counting was what you did when a thing you had built with three winters was being read like a public notice. On the eighth second the boy frowned. On the tenth he said, "You're wasting it there," and put the lattice back.</w:t>
+      </w:r>
+    </w:p>
+    <w:p>
+      <w:pPr>
+        <w:spacing w:line="360" w:lineRule="auto" w:after="160"/>
+        <w:ind w:firstLine="403"/>
+        <w:jc w:val="both"/>
+      </w:pPr>
+      <w:r>
+        <w:rPr>
+          <w:rFonts w:ascii="Garamond" w:hAnsi="Garamond" w:eastAsia="Garamond"/>
+          <w:b w:val="0"/>
+          <w:i w:val="0"/>
+          <w:color w:val="2A241C"/>
+          <w:sz w:val="22"/>
+        </w:rPr>
+        <w:t>It was Glassheart. It was not Glassheart. The mesh was the same geometry and the joins did not itch. The debit was gone. The hall's warmth sat as if it had been poured and left to set, no spend, no tremble, a held hand that did not get tired. Worse: the overflow at the boy's ribs stopped climbing and went into the mesh and came back as evenness, a return Orin had not written, a kindness in the arithmetic. The scorch-circles on the floor darkened, then paled, then became only old marks again. Lyra swore, a small professional word. Cinder sneezed. Orin stood in his father's hall and felt three years become a preface, and the feeling was not only humiliation. It was the first clean hunger he had had since the letter about Lirae. A problem that large. A well that could copy a cathedral knot and improve the spend in the time it took to be insulted.</w:t>
+      </w:r>
+    </w:p>
+    <w:p>
+      <w:pPr>
+        <w:spacing w:line="360" w:lineRule="auto" w:after="160"/>
+        <w:ind w:firstLine="403"/>
+        <w:jc w:val="both"/>
+      </w:pPr>
+      <w:r>
+        <w:rPr>
+          <w:rFonts w:ascii="Garamond" w:hAnsi="Garamond" w:eastAsia="Garamond"/>
+          <w:b w:val="0"/>
+          <w:i w:val="0"/>
+          <w:color w:val="2A241C"/>
+          <w:sz w:val="22"/>
+        </w:rPr>
+        <w:t>He put his palm near the mesh, not through it. The heat there was even as breath. No flicker at the join he had nursed like a sick animal through two winters of notes. He could see, now that the boy had closed it, the waste he had been spending as a kind of superstition, a tithe to the form itself. The academy would have called the improvement heresy and then written it into next year's primer with someone else's name on it. Orin almost laughed and did not, because laughter in this hall would have gone down the west corridor and found a door.</w:t>
+      </w:r>
+    </w:p>
+    <w:p>
+      <w:pPr>
+        <w:spacing w:line="360" w:lineRule="auto" w:after="160"/>
+        <w:ind w:firstLine="403"/>
+        <w:jc w:val="both"/>
+      </w:pPr>
+      <w:r>
+        <w:rPr>
+          <w:rFonts w:ascii="Garamond" w:hAnsi="Garamond" w:eastAsia="Garamond"/>
+          <w:b w:val="0"/>
+          <w:i w:val="0"/>
+          <w:color w:val="2A241C"/>
+          <w:sz w:val="22"/>
+        </w:rPr>
+        <w:t>"Do that again," Orin said. His voice came out too young. He hated that. Ren shrugged, which was unbearable. "I didn't do it to be a lesson. Your door was humming. It was rude." He glanced at the west wing without knowing why, or perhaps he did, the way heat knew where the cold had sat longest. "Someone froze in here. Recently. The walls still have it. If your lattice had been this the first time, maybe—" He stopped, because even a slum boy could hear a sentence that should not be finished. Orin heard the rest anyway. He saw Lirae's door. He saw the charity bench. He saw the Church seal on the letter. The improved Glassheart held the hall and did not care about his face.</w:t>
+      </w:r>
+    </w:p>
+    <w:p>
+      <w:pPr>
+        <w:spacing w:line="360" w:lineRule="auto" w:after="160"/>
+        <w:ind w:firstLine="403"/>
+        <w:jc w:val="both"/>
+      </w:pPr>
+      <w:r>
+        <w:rPr>
+          <w:rFonts w:ascii="Garamond" w:hAnsi="Garamond" w:eastAsia="Garamond"/>
+          <w:b w:val="0"/>
+          <w:i w:val="0"/>
+          <w:color w:val="2A241C"/>
+          <w:sz w:val="22"/>
+        </w:rPr>
+        <w:t>Lyra lowered the sabers a fraction. "We don't have a third winter for your feelings, Hale. Purge squads will try the front wax within the hour. The canals run under this terrace. You know that or you don't deserve the coat." She looked at him properly then, not as a category, as a nineteen-year-old with a satchel and a dead house. "He'll light the next net too. He'll run at the dying until there isn't a street left. I can cut a path. I cannot teach him not to cook the path. You want a shape on it, you come and put a shape on it. Or you sit in your scorch-circles and be a preface. I am out of patience for prefaces."</w:t>
+      </w:r>
+    </w:p>
+    <w:p>
+      <w:pPr>
+        <w:spacing w:line="360" w:lineRule="auto" w:after="160"/>
+        <w:ind w:firstLine="403"/>
+        <w:jc w:val="both"/>
+      </w:pPr>
+      <w:r>
+        <w:rPr>
+          <w:rFonts w:ascii="Garamond" w:hAnsi="Garamond" w:eastAsia="Garamond"/>
+          <w:b w:val="0"/>
+          <w:i w:val="0"/>
+          <w:color w:val="2A241C"/>
+          <w:sz w:val="22"/>
+        </w:rPr>
+        <w:t>Orin looked at the boy who had improved his life's work as an afterthought, and at the dog, and at the woman who had been an inquisitor and was now a warrant, and at the satchel on the rail that held a gray scarf with no smell. Joining was a word the academy used for houses and orders. This was not that. This was picking up the satchel. This was dropping his own Glassheart because the better one was already in the doorway, sitting there like an insult he intended to live with. "If I come," he said, "you don't mention my sister as weather. You don't use her as a reason I should be grateful you exist. I will put shapes on him because the Church will put a sink on him, and I have seen what sinks do, and I am tired of watching the arithmetic from a bench." Ren nodded, once, as if a contract had been a loaf broken in four. "I don't do speeches," he said. "You want to walk, walk. If you hum at me again I will fix it again and you will have to live with that too."</w:t>
+      </w:r>
+    </w:p>
+    <w:p>
+      <w:pPr>
+        <w:spacing w:line="360" w:lineRule="auto" w:after="160"/>
+        <w:ind w:firstLine="403"/>
+        <w:jc w:val="both"/>
+      </w:pPr>
+      <w:r>
+        <w:rPr>
+          <w:rFonts w:ascii="Garamond" w:hAnsi="Garamond" w:eastAsia="Garamond"/>
+          <w:b w:val="0"/>
+          <w:i w:val="0"/>
+          <w:color w:val="2A241C"/>
+          <w:sz w:val="22"/>
+        </w:rPr>
+        <w:t>They left by the servants' stair, the wax on the front doors still intact, the notice still sure of itself. Orin did not look back at the west wing. In the kitchen he paused long enough to set a small ordinary latch, the kind that kept out weather and not Churchmen, because ritual was what you had when you could not lock a life. The improved lattice would hold a while and then go out, and the manse would be an empty house again, and that was the correct temperature for a place that had already done its worst.</w:t>
+      </w:r>
+    </w:p>
+    <w:p>
+      <w:pPr>
+        <w:spacing w:line="360" w:lineRule="auto" w:after="160"/>
+        <w:ind w:firstLine="403"/>
+        <w:jc w:val="both"/>
+      </w:pPr>
+      <w:r>
+        <w:rPr>
+          <w:rFonts w:ascii="Garamond" w:hAnsi="Garamond" w:eastAsia="Garamond"/>
+          <w:b w:val="0"/>
+          <w:i w:val="0"/>
+          <w:color w:val="2A241C"/>
+          <w:sz w:val="22"/>
+        </w:rPr>
+        <w:t>In the alley the ember-canals breathed their old, bottled heat through the grates, a city's veins, the way heat moved when it belonged to men who sold it. Lyra took point. The dog took the boy's heel. Orin took the rear with the satchel and the three-year notes that were now a museum, and he found, to his own irritated surprise, that he was not walking toward a vessel. He was walking toward a problem that could copy him, and the problem had a name, and the name was going to be a brother or a ruin, and either way he was done with charity cells.</w:t>
+      </w:r>
+    </w:p>
+    <w:p>
+      <w:r>
+        <w:br w:type="page"/>
+      </w:r>
+    </w:p>
+    <w:p>
+      <w:pPr>
+        <w:spacing w:after="120"/>
+        <w:jc w:val="center"/>
+      </w:pPr>
+      <w:r>
+        <w:rPr>
+          <w:rFonts w:ascii="Garamond" w:hAnsi="Garamond" w:eastAsia="Garamond"/>
+          <w:b w:val="0"/>
+          <w:i w:val="0"/>
+          <w:color w:val="8A6230"/>
+          <w:sz w:val="22"/>
+        </w:rPr>
+        <w:t>CHAPTER 8</w:t>
+      </w:r>
+    </w:p>
+    <w:p>
+      <w:pPr>
+        <w:spacing w:after="440"/>
+        <w:jc w:val="center"/>
+      </w:pPr>
+      <w:r>
+        <w:rPr>
+          <w:rFonts w:ascii="Garamond" w:hAnsi="Garamond" w:eastAsia="Garamond"/>
+          <w:b w:val="0"/>
+          <w:i w:val="0"/>
+          <w:color w:val="2A241C"/>
+          <w:sz w:val="44"/>
+        </w:rPr>
+        <w:t>Flight from Vireth</w:t>
+      </w:r>
+    </w:p>
+    <w:p>
+      <w:pPr>
+        <w:spacing w:line="360" w:lineRule="auto" w:after="160"/>
+        <w:ind w:firstLine="0"/>
+        <w:jc w:val="both"/>
+      </w:pPr>
+      <w:r>
+        <w:rPr>
+          <w:rFonts w:ascii="Garamond" w:hAnsi="Garamond" w:eastAsia="Garamond"/>
+          <w:b w:val="0"/>
+          <w:i w:val="0"/>
+          <w:color w:val="2A241C"/>
+          <w:sz w:val="22"/>
+        </w:rPr>
+        <w:t>The ember-canals took them the way they took the city's heat: without asking, in a brick throat, on a current that smelled of well-steam and old iron and the particular rot of water that had been sold too many times. Ren walked the towpath with Cinder's ruff in his fist and the improved lattice still sitting on his ribs like a borrowed coat, Orin's geometry, nicer than anything the Kiln had ever held. The water beside them ran dark and should have steamed more than it did. Nobles bottled this and piped it under the terraces so their rooms could have little indoor noons, and the slums got the drip through the wagon-slats. He had known that. Knowing it while walking in the vein was different. It made his cooked palms itch.</w:t>
+      </w:r>
+    </w:p>
+    <w:p>
+      <w:pPr>
+        <w:spacing w:line="360" w:lineRule="auto" w:after="160"/>
+        <w:ind w:firstLine="403"/>
+        <w:jc w:val="both"/>
+      </w:pPr>
+      <w:r>
+        <w:rPr>
+          <w:rFonts w:ascii="Garamond" w:hAnsi="Garamond" w:eastAsia="Garamond"/>
+          <w:b w:val="0"/>
+          <w:i w:val="0"/>
+          <w:color w:val="2A241C"/>
+          <w:sz w:val="22"/>
+        </w:rPr>
+        <w:t>Lyra went first, sabers sheathed, seals ticking against the canal's spent heat in a low annoyed hum. Orin came last with the satchel and a commentary he could not keep in his mouth. "If you hold the lattice tighter at the third join you'll stop lighting the water," he said. "You're leaking into the current. That's a signature. That's a map." Ren said, "If I hold it tighter I am going to throw up on your notes." Cinder sneezed at the well-stink and kept her three-beat, stump wrapped in a rag that had been almost clean that morning and was not now. Behind them, far up the brick, a horn tried a note and lost it in the steam. Rhel, or someone Rhel had sent. The canals had branches. The canals had locks. The canals, Ren was beginning to understand, had been built by people who assumed the things in them would stay owned.</w:t>
+      </w:r>
+    </w:p>
+    <w:p>
+      <w:pPr>
+        <w:spacing w:line="360" w:lineRule="auto" w:after="160"/>
+        <w:ind w:firstLine="403"/>
+        <w:jc w:val="both"/>
+      </w:pPr>
+      <w:r>
+        <w:rPr>
+          <w:rFonts w:ascii="Garamond" w:hAnsi="Garamond" w:eastAsia="Garamond"/>
+          <w:b w:val="0"/>
+          <w:i w:val="0"/>
+          <w:color w:val="2A241C"/>
+          <w:sz w:val="22"/>
+        </w:rPr>
+        <w:t>They hit the first lock at a bend where the brick gave way to older stone, black, the same wound-rock as the Wellgate's bowl. The sluice was down. Church wax on the winch. A null-charm nailed to the gate, pale as Ren's old brand, a cousin to the foundling kindness that had been a lid. The water on their side slapped and went nowhere. Orin swore in a language that sounded like tuition. Lyra put a saber to the wax and the seal ate it and the charm did not care. "Null's a different church," she said. "Older. They used these when vessels were still a rumor. It doesn't drink heat. It refuses the conversation." She looked at Ren. "Don't copy it. Last time you copied a refusal you turned a net into a sunrise and I had to become a criminal. Find another trick."</w:t>
+      </w:r>
+    </w:p>
+    <w:p>
+      <w:pPr>
+        <w:spacing w:line="360" w:lineRule="auto" w:after="160"/>
+        <w:ind w:firstLine="403"/>
+        <w:jc w:val="both"/>
+      </w:pPr>
+      <w:r>
+        <w:rPr>
+          <w:rFonts w:ascii="Garamond" w:hAnsi="Garamond" w:eastAsia="Garamond"/>
+          <w:b w:val="0"/>
+          <w:i w:val="0"/>
+          <w:color w:val="2A241C"/>
+          <w:sz w:val="22"/>
+        </w:rPr>
+        <w:t>Above the brick, Vireth went on being a city. He could hear it through the grates: a wagon, a shout, someone calling a child in from a trough that might run or might not. The melt-band would be a circus of clerks and gasping people and a ring of burst iron, and Nima, if she had any sense, would be behind a nailed door-cloth not looking at the sky. He hoped she had sense. He did not bet on it. The hope sat in him next to the dominion he had not used yet, two bad ideas keeping each other company. Cinder nosed his wrist as if to say the lock was the problem in the room, and the city could wait its turn.</w:t>
+      </w:r>
+    </w:p>
+    <w:p>
+      <w:pPr>
+        <w:spacing w:line="360" w:lineRule="auto" w:after="160"/>
+        <w:ind w:firstLine="403"/>
+        <w:jc w:val="both"/>
+      </w:pPr>
+      <w:r>
+        <w:rPr>
+          <w:rFonts w:ascii="Garamond" w:hAnsi="Garamond" w:eastAsia="Garamond"/>
+          <w:b w:val="0"/>
+          <w:i w:val="0"/>
+          <w:color w:val="2A241C"/>
+          <w:sz w:val="22"/>
+        </w:rPr>
+        <w:t>He did not have another trick. He had overflow and pinch and a stolen shield and a stolen hunger and a lattice he had improved because a door was humming. The horn came again, closer, two-three, two-three, purge pace on a towpath. Cinder's hackles went up. Ren put his hand on the null-charm and felt the conversation being refused, a cold so complete it was a kind of deafness. The thing in his ribs leaned in anyway, rude, and found no pattern to steal. You could not copy a silence. He took his hand off. The sluice stayed down. Orin was already building Glassheart against the charm, three-year knot, spending what he had, and the mesh beaded on the null and slid off like water on grease.</w:t>
+      </w:r>
+    </w:p>
+    <w:p>
+      <w:pPr>
+        <w:spacing w:line="360" w:lineRule="auto" w:after="160"/>
+        <w:ind w:firstLine="403"/>
+        <w:jc w:val="both"/>
+      </w:pPr>
+      <w:r>
+        <w:rPr>
+          <w:rFonts w:ascii="Garamond" w:hAnsi="Garamond" w:eastAsia="Garamond"/>
+          <w:b w:val="0"/>
+          <w:i w:val="0"/>
+          <w:color w:val="2A241C"/>
+          <w:sz w:val="22"/>
+        </w:rPr>
+        <w:t xml:space="preserve">"Move aside," Ren said, and did not wait to see if they did. He did not reach for a copy. He reached for the space. The lock, the winch, the water, the yard of air between his mouth and the gate: he asked it to be his the way he had asked the crumb to last, not a theft this time, a claim. The word that showed up in his head was not a slum word. It was older. </w:t>
+      </w:r>
+      <w:r>
+        <w:rPr>
+          <w:rFonts w:ascii="Garamond" w:hAnsi="Garamond" w:eastAsia="Garamond"/>
+          <w:b w:val="0"/>
+          <w:i/>
+          <w:color w:val="2A241C"/>
+          <w:sz w:val="22"/>
+        </w:rPr>
+        <w:t>Dominion.</w:t>
+      </w:r>
+      <w:r>
+        <w:rPr>
+          <w:rFonts w:ascii="Garamond" w:hAnsi="Garamond" w:eastAsia="Garamond"/>
+          <w:b w:val="0"/>
+          <w:i w:val="0"/>
+          <w:color w:val="2A241C"/>
+          <w:sz w:val="22"/>
+        </w:rPr>
+        <w:t xml:space="preserve"> He did not like it. He used it. Heat did not flood. It sat. For a handful of heartbeats the lock was noon in a throat of brick, not gold spilled, gold held, a small hard sun with edges. The null-charm cracked down the pale seam, the same seam his brand had had. The sluice went up as if a winch had remembered its job. The water shouldered through. Cinder barked once, offended by the new weather.</w:t>
+      </w:r>
+    </w:p>
+    <w:p>
+      <w:pPr>
+        <w:spacing w:line="360" w:lineRule="auto" w:after="160"/>
+        <w:ind w:firstLine="403"/>
+        <w:jc w:val="both"/>
+      </w:pPr>
+      <w:r>
+        <w:rPr>
+          <w:rFonts w:ascii="Garamond" w:hAnsi="Garamond" w:eastAsia="Garamond"/>
+          <w:b w:val="0"/>
+          <w:i w:val="0"/>
+          <w:color w:val="2A241C"/>
+          <w:sz w:val="22"/>
+        </w:rPr>
+        <w:t>Orin said, very quietly, "That is not a form." His face had the look from the manse, hunger and insult braided. "That is a territory. You made a territory the size of a door and the door agreed." Lyra had both sabers out though there was nothing to cut. "Solar Dominion," she said, and the name came out like a warrant she had hoped not to serve. "The psalms call it the sin of lids. You don't spend heat. You rule it. The last ones who tried were the ones Solenne still won't put in the public lists." She looked at the cracked charm, then at him, then at the disk they could not see under all this brick. "Don't do it twice in an hour. I like your manners. I like them better when you're not a country."</w:t>
+      </w:r>
+    </w:p>
+    <w:p>
+      <w:pPr>
+        <w:spacing w:line="360" w:lineRule="auto" w:after="160"/>
+        <w:ind w:firstLine="403"/>
+        <w:jc w:val="both"/>
+      </w:pPr>
+      <w:r>
+        <w:rPr>
+          <w:rFonts w:ascii="Garamond" w:hAnsi="Garamond" w:eastAsia="Garamond"/>
+          <w:b w:val="0"/>
+          <w:i w:val="0"/>
+          <w:color w:val="2A241C"/>
+          <w:sz w:val="22"/>
+        </w:rPr>
+        <w:t xml:space="preserve">They went through on the current, half running the towpath, half dragged, the dog swimming the ugly determined circles she had swum in the cisterns. Ren held the lattice and did not hold the dominion. The dominion had left a taste in his mouth like a coin. The Hollow Sun was still a lid over the city and also, now, a weight on the back of his neck, as if the claim had been heard by something that had once owned every claim. He thought of the stare in the tannery lane. He did not tell them. Telling them would have made it a problem with a shape, and Orin would have tried to put a lattice on the sky. Behind, the horn stopped at the lock. Someone had found the cracked charm. Someone would write </w:t>
+      </w:r>
+      <w:r>
+        <w:rPr>
+          <w:rFonts w:ascii="Garamond" w:hAnsi="Garamond" w:eastAsia="Garamond"/>
+          <w:b w:val="0"/>
+          <w:i/>
+          <w:color w:val="2A241C"/>
+          <w:sz w:val="22"/>
+        </w:rPr>
+        <w:t>dominion</w:t>
+      </w:r>
+      <w:r>
+        <w:rPr>
+          <w:rFonts w:ascii="Garamond" w:hAnsi="Garamond" w:eastAsia="Garamond"/>
+          <w:b w:val="0"/>
+          <w:i w:val="0"/>
+          <w:color w:val="2A241C"/>
+          <w:sz w:val="22"/>
+        </w:rPr>
+        <w:t xml:space="preserve"> on a tablet and take the stairs two at a time.</w:t>
+      </w:r>
+    </w:p>
+    <w:p>
+      <w:pPr>
+        <w:spacing w:line="360" w:lineRule="auto" w:after="160"/>
+        <w:ind w:firstLine="403"/>
+        <w:jc w:val="both"/>
+      </w:pPr>
+      <w:r>
+        <w:rPr>
+          <w:rFonts w:ascii="Garamond" w:hAnsi="Garamond" w:eastAsia="Garamond"/>
+          <w:b w:val="0"/>
+          <w:i w:val="0"/>
+          <w:color w:val="2A241C"/>
+          <w:sz w:val="22"/>
+        </w:rPr>
+        <w:t>The canals spit them out at the frost-edge just after the cold hour, through a grate that had been a smugglers' mouth when the Hale well-rights were still a fact. Vireth ended the way a conversation ended: badly, with leftover words. The last kiln-houses stood with their backs to a pale waste, rime to the horizon, the Nightlands starting as a simple fact of less. No more piped heat. No more troughs. The Hollow Sun hung over both city and waste without preferring either, black disk, cold light, and the stripe of melt in Cinderrow was already a rumor from here, a darker smear on the slums that would go white again as soon as he was far enough to be a story.</w:t>
+      </w:r>
+    </w:p>
+    <w:p>
+      <w:pPr>
+        <w:spacing w:line="360" w:lineRule="auto" w:after="160"/>
+        <w:ind w:firstLine="403"/>
+        <w:jc w:val="both"/>
+      </w:pPr>
+      <w:r>
+        <w:rPr>
+          <w:rFonts w:ascii="Garamond" w:hAnsi="Garamond" w:eastAsia="Garamond"/>
+          <w:b w:val="0"/>
+          <w:i w:val="0"/>
+          <w:color w:val="2A241C"/>
+          <w:sz w:val="22"/>
+        </w:rPr>
+        <w:t>He could pick out the Wellgate's sag from here if he squinted, a drunk disk in a wall. He did not squint long. Looking made a plan. Plans made him stay. Cinder put her stump on his boot, which was her way of charging rent on his attention. Orin was already shivering in the coat that had been his father's; academy blood went thin at the first honest cold. Lyra did not shiver. She had the look of someone counting exits in a place that had none.</w:t>
+      </w:r>
+    </w:p>
+    <w:p>
+      <w:pPr>
+        <w:spacing w:line="360" w:lineRule="auto" w:after="160"/>
+        <w:ind w:firstLine="403"/>
+        <w:jc w:val="both"/>
+      </w:pPr>
+      <w:r>
+        <w:rPr>
+          <w:rFonts w:ascii="Garamond" w:hAnsi="Garamond" w:eastAsia="Garamond"/>
+          <w:b w:val="0"/>
+          <w:i w:val="0"/>
+          <w:color w:val="2A241C"/>
+          <w:sz w:val="22"/>
+        </w:rPr>
+        <w:t>Ren stopped. Cinder stopped because he did. The city was a pile of smoke and shut gates and ten streets that had been warm because he stood in them. Nima's yellow fingertips. Toma's thin face. Mrs. Pell's boy who had not come back. If he turned around he could light another net. He could sit in the Kiln and hold a noon the size of a neighborhood until the Church came and made a chapel out of the door-cloth. He could be a stove they nailed in place. The thought had a miserable pull, like the crumb, like the brand, like every small heat he had ever been allowed to chew.</w:t>
+      </w:r>
+    </w:p>
+    <w:p>
+      <w:pPr>
+        <w:spacing w:line="360" w:lineRule="auto" w:after="160"/>
+        <w:ind w:firstLine="403"/>
+        <w:jc w:val="both"/>
+      </w:pPr>
+      <w:r>
+        <w:rPr>
+          <w:rFonts w:ascii="Garamond" w:hAnsi="Garamond" w:eastAsia="Garamond"/>
+          <w:b w:val="0"/>
+          <w:i w:val="0"/>
+          <w:color w:val="2A241C"/>
+          <w:sz w:val="22"/>
+        </w:rPr>
+        <w:t>Lyra did not take his arm. She stood beside him with the ash-coat open and the waste in front of them and the city behind, and she said it as if she were tired of being the person who said it. "You can't warm a city by standing still in a cage." He looked at her. She looked at the disk, not at him. "I have seen the cage. They will call it an emberwell and then a shrine and then a lesson. You will last as long as the seals do. The children you want to keep will be brought to look at you on feast days, and then the troughs will freeze on a schedule, and you will still be standing there being useful. Come on. The nightlands are honest. They will try to kill you without calling it mercy."</w:t>
+      </w:r>
+    </w:p>
+    <w:p>
+      <w:pPr>
+        <w:spacing w:line="360" w:lineRule="auto" w:after="160"/>
+        <w:ind w:firstLine="403"/>
+        <w:jc w:val="both"/>
+      </w:pPr>
+      <w:r>
+        <w:rPr>
+          <w:rFonts w:ascii="Garamond" w:hAnsi="Garamond" w:eastAsia="Garamond"/>
+          <w:b w:val="0"/>
+          <w:i w:val="0"/>
+          <w:color w:val="2A241C"/>
+          <w:sz w:val="22"/>
+        </w:rPr>
+        <w:t>Orin had the satchel against his hip and his eyes on the rime. "She's ugly and she's right," he said. "If dominion is a territory, you need room to learn the size of it. That city is a snare with better brick. My house already taught me what happens when the heat stays in one room." He did not say Lirae. He had been promised that. The not-saying was loud anyway. Ren put his palm on Cinder's skull and felt the three-legged engine going, stubborn as a grate-thief. He was seventeen. He was tired of chewing crumbs. He was more tired of the idea that the only way to be good was to be nailed down and spent.</w:t>
+      </w:r>
+    </w:p>
+    <w:p>
+      <w:pPr>
+        <w:spacing w:line="360" w:lineRule="auto" w:after="160"/>
+        <w:ind w:firstLine="403"/>
+        <w:jc w:val="both"/>
+      </w:pPr>
+      <w:r>
+        <w:rPr>
+          <w:rFonts w:ascii="Garamond" w:hAnsi="Garamond" w:eastAsia="Garamond"/>
+          <w:b w:val="0"/>
+          <w:i w:val="0"/>
+          <w:color w:val="2A241C"/>
+          <w:sz w:val="22"/>
+        </w:rPr>
+        <w:t>"If we die in the waste," he said, "I want it on record that I voted no." "No you didn't," Lyra said, and the dry almost-grin was back, the unauthorized one from the bone-dust. She had not been there for Nima's version. She had the timing anyway. Cinder shoved his knee toward the rime, which settled it a second time. They walked off the last paved lip of Vireth into frost that had never agreed to a tithe, and behind them the ember-canals ticked in their brick, and above them the disk watched with the patience of a thing that had died and not finished dying, and Ren felt the dominion still sitting in his mouth, a coin, a claim, a door he had opened inward on a country that was himself.</w:t>
+      </w:r>
+    </w:p>
+    <w:p>
+      <w:r>
+        <w:br w:type="page"/>
+      </w:r>
+    </w:p>
+    <w:p>
+      <w:pPr>
+        <w:spacing w:after="120"/>
+        <w:jc w:val="center"/>
+      </w:pPr>
+      <w:r>
+        <w:rPr>
+          <w:rFonts w:ascii="Garamond" w:hAnsi="Garamond" w:eastAsia="Garamond"/>
+          <w:b w:val="0"/>
+          <w:i w:val="0"/>
+          <w:color w:val="8A6230"/>
+          <w:sz w:val="22"/>
+        </w:rPr>
+        <w:t>CHAPTER 9</w:t>
+      </w:r>
+    </w:p>
+    <w:p>
+      <w:pPr>
+        <w:spacing w:after="440"/>
+        <w:jc w:val="center"/>
+      </w:pPr>
+      <w:r>
+        <w:rPr>
+          <w:rFonts w:ascii="Garamond" w:hAnsi="Garamond" w:eastAsia="Garamond"/>
+          <w:b w:val="0"/>
+          <w:i w:val="0"/>
+          <w:color w:val="2A241C"/>
+          <w:sz w:val="44"/>
+        </w:rPr>
+        <w:t>The Nightlands</w:t>
+      </w:r>
+    </w:p>
+    <w:p>
+      <w:pPr>
+        <w:spacing w:line="360" w:lineRule="auto" w:after="160"/>
+        <w:ind w:firstLine="0"/>
+        <w:jc w:val="both"/>
+      </w:pPr>
+      <w:r>
+        <w:rPr>
+          <w:rFonts w:ascii="Garamond" w:hAnsi="Garamond" w:eastAsia="Garamond"/>
+          <w:b w:val="0"/>
+          <w:i w:val="0"/>
+          <w:color w:val="2A241C"/>
+          <w:sz w:val="22"/>
+        </w:rPr>
+        <w:t>The rime was not weather. Weather changed its mind. This had decided. Ren walked with his chin in his collar and Cinder's heat against his shin, the improved lattice held as tight as he could stand without throwing up on Orin's notes, and still the cold came in at the seams as if seams were an invitation. Vireth's cold had been a tax. This was a country. The Hollow Sun hung the same, black disk, lid-light, but the light here did not bounce off brick and smoke. It went into the pale and did not come back. Distance became a rumor. The last kiln-house had been a thumb of dark behind them and then it was not.</w:t>
+      </w:r>
+    </w:p>
+    <w:p>
+      <w:pPr>
+        <w:spacing w:line="360" w:lineRule="auto" w:after="160"/>
+        <w:ind w:firstLine="403"/>
+        <w:jc w:val="both"/>
+      </w:pPr>
+      <w:r>
+        <w:rPr>
+          <w:rFonts w:ascii="Garamond" w:hAnsi="Garamond" w:eastAsia="Garamond"/>
+          <w:b w:val="0"/>
+          <w:i w:val="0"/>
+          <w:color w:val="2A241C"/>
+          <w:sz w:val="22"/>
+        </w:rPr>
+        <w:t>Orin talked because silence made him spend heat on thinking. "Hollow beasts hunt the gradient," he said. "They are not alive in the way a dog is alive. They are a cavity with legs. You will want to feed them. Don't. Feeding is how they find the rest of you." Lyra said, "He has a teacher now. How refreshing. The teacher should save his breath for the part where the cavity tries to wear his face." She had both sabers out. The seals smoked in this air, a thin ugly incense. Cinder did not like the waste. She walked wide of Lyra and closer to Ren, stump punching little holes in the crust that filled as soon as she lifted. Ren said, "If something tries to wear my face it can get in line. The Church already called dibs." It came out flatter than a joke. He let it.</w:t>
+      </w:r>
+    </w:p>
+    <w:p>
+      <w:pPr>
+        <w:spacing w:line="360" w:lineRule="auto" w:after="160"/>
+        <w:ind w:firstLine="403"/>
+        <w:jc w:val="both"/>
+      </w:pPr>
+      <w:r>
+        <w:rPr>
+          <w:rFonts w:ascii="Garamond" w:hAnsi="Garamond" w:eastAsia="Garamond"/>
+          <w:b w:val="0"/>
+          <w:i w:val="0"/>
+          <w:color w:val="2A241C"/>
+          <w:sz w:val="22"/>
+        </w:rPr>
+        <w:t>The first hollow found them at a stand of trees that were not trees, gray trunks without rings, grown from frost the way lichen grew from neglect. It came on all fours and then on two and then on a number that was not polite, a packed-rime body with a hole in the chest you could have put a loaf through. No heart. No steam. The cavity faced them and leaned, hungry for the lattice, for the gold still ghosting Ren's mouth, for Cinder's small furnace. Orin threw a primer-sheet that went through it and spent itself on snow. Lyra cut. The saber took a forelimb and the forelimb did not mind. The hollow stepped in on the stub and the cavity widened, a mouth that had learned a new trick.</w:t>
+      </w:r>
+    </w:p>
+    <w:p>
+      <w:pPr>
+        <w:spacing w:line="360" w:lineRule="auto" w:after="160"/>
+        <w:ind w:firstLine="403"/>
+        <w:jc w:val="both"/>
+      </w:pPr>
+      <w:r>
+        <w:rPr>
+          <w:rFonts w:ascii="Garamond" w:hAnsi="Garamond" w:eastAsia="Garamond"/>
+          <w:b w:val="0"/>
+          <w:i w:val="0"/>
+          <w:color w:val="2A241C"/>
+          <w:sz w:val="22"/>
+        </w:rPr>
+        <w:t>Ren did not feed it. He wanted to. The stupid size again, the crumb size, the size that had run at a net. He pinched instead, pulled the lattice in until the hall-warmth was only a skin on his ribs, and the hollow hesitated, gradient flattened, a hound that had lost a scent. Lyra used the hesitation. She put a seal into the cavity and the script flared and the packed rime forgot how to be a body. It fell as a scatter of white and a smell like a well gone dry. "Don't copy that one," she said, already turning. "There's nothing in it to steal but the want, and you've got enough want." Cinder barked at the scatter until it was only snow. Ren put a hand on her skull and felt her shake, the three-legged engine skipping a beat and then catching.</w:t>
+      </w:r>
+    </w:p>
+    <w:p>
+      <w:pPr>
+        <w:spacing w:line="360" w:lineRule="auto" w:after="160"/>
+        <w:ind w:firstLine="403"/>
+        <w:jc w:val="both"/>
+      </w:pPr>
+      <w:r>
+        <w:rPr>
+          <w:rFonts w:ascii="Garamond" w:hAnsi="Garamond" w:eastAsia="Garamond"/>
+          <w:b w:val="0"/>
+          <w:i w:val="0"/>
+          <w:color w:val="2A241C"/>
+          <w:sz w:val="22"/>
+        </w:rPr>
+        <w:t>They walked. The un-trees thinned into a flat that had once been a river, if the groove in the rime was a memory and not a trick. No water. A pale road of packed cold, wide enough for a tithe-wagon, empty enough to make Orin keep glancing at the sky as if a form might be written there. Lyra said, "Stay off the middle. Middles are for things that want to be seen." Ren stayed off the middle. Cinder did not, because she had opinions about roads, and the crust held her anyway, which was a small mercy he decided not to examine.</w:t>
+      </w:r>
+    </w:p>
+    <w:p>
+      <w:pPr>
+        <w:spacing w:line="360" w:lineRule="auto" w:after="160"/>
+        <w:ind w:firstLine="403"/>
+        <w:jc w:val="both"/>
+      </w:pPr>
+      <w:r>
+        <w:rPr>
+          <w:rFonts w:ascii="Garamond" w:hAnsi="Garamond" w:eastAsia="Garamond"/>
+          <w:b w:val="0"/>
+          <w:i w:val="0"/>
+          <w:color w:val="2A241C"/>
+          <w:sz w:val="22"/>
+        </w:rPr>
+        <w:t>They came in a line after that, as if the first had been a bell. Four, then seven, then a clump that had been a herd of something in a world with a living sun, now cavities on the old legs, frost grown in the shape of memory. Orin stopped lecturing and started spending, Glassheart thrown up in panels, a maze of held rooms the hollows blundered through and could not quite smell. Lyra cut what got near. Ren held the lattice and did not hold dominion, because the last time he had claimed a door the disk had put a weight on his neck, and he did not want to claim a country that was already a grave. A hollow got Cinder's rag in its nothing-mouth. He burned the rag off and not the dog, which took a precision he did not remember deciding on. She licked his wrist as payment and then bit him, gentle, a reminder that precision was not the same as permission.</w:t>
+      </w:r>
+    </w:p>
+    <w:p>
+      <w:pPr>
+        <w:spacing w:line="360" w:lineRule="auto" w:after="160"/>
+        <w:ind w:firstLine="403"/>
+        <w:jc w:val="both"/>
+      </w:pPr>
+      <w:r>
+        <w:rPr>
+          <w:rFonts w:ascii="Garamond" w:hAnsi="Garamond" w:eastAsia="Garamond"/>
+          <w:b w:val="0"/>
+          <w:i w:val="0"/>
+          <w:color w:val="2A241C"/>
+          <w:sz w:val="22"/>
+        </w:rPr>
+        <w:t>"Banter, you said," Ren told Lyra, between breaths. "This is a lot of work for banter." "I said the nightlands were honest," she said. "I did not say they were a salon." Orin, pale, satchel banging, managed, "If he uses dominion here he will wake everything with a cavity in a day's walk. Please do not be interesting for ten minutes." Ren laughed, gold-free, which felt like stealing something back from the split. "Ten minutes. Put it on the wall in charcoal. I'll keep Nima's system." The name hurt in the open pale. He let it hurt. Hurting was a way of not becoming a lid.</w:t>
+      </w:r>
+    </w:p>
+    <w:p>
+      <w:pPr>
+        <w:spacing w:line="360" w:lineRule="auto" w:after="160"/>
+        <w:ind w:firstLine="403"/>
+        <w:jc w:val="both"/>
+      </w:pPr>
+      <w:r>
+        <w:rPr>
+          <w:rFonts w:ascii="Garamond" w:hAnsi="Garamond" w:eastAsia="Garamond"/>
+          <w:b w:val="0"/>
+          <w:i w:val="0"/>
+          <w:color w:val="2A241C"/>
+          <w:sz w:val="22"/>
+        </w:rPr>
+        <w:t>The frost-wolf arrived without a gradient. That was the wrongness. The hollows had been hunger on legs. This was a decision. It stood on a rise of rime that had not been a rise a blink before, pale coat, too many joints in the legs, eyes the color of the disk's cold light, and it was the size of the vat in the tannery lane, which was a stupid measure and the one he had. The hollows nearest it lay down as if a tax had been called. Cinder went still in a way she had not gone still for sabers or gold or a net. Lyra's seals ticked and then quieted, not eaten, dismissed. Orin whispered a form-name that did not apply and shut his mouth.</w:t>
+      </w:r>
+    </w:p>
+    <w:p>
+      <w:pPr>
+        <w:spacing w:line="360" w:lineRule="auto" w:after="160"/>
+        <w:ind w:firstLine="403"/>
+        <w:jc w:val="both"/>
+      </w:pPr>
+      <w:r>
+        <w:rPr>
+          <w:rFonts w:ascii="Garamond" w:hAnsi="Garamond" w:eastAsia="Garamond"/>
+          <w:b w:val="0"/>
+          <w:i w:val="0"/>
+          <w:color w:val="2A241C"/>
+          <w:sz w:val="22"/>
+        </w:rPr>
+        <w:t>The wolf came down the rise and the rime did not crunch. It stopped at the distance a polite dog would stop, which was worse than a charge. It looked at Ren's ribs, at the split, at the lattice, at the little leftover gold, and then it did the thing that took the fight out of the hour. It bowed. Not a trick. Not a hunter's crouch. A bow, forelegs out, chest on the crust, the too-many-jointed spine a long pale curve, eyes still on him. Cinder made a sound Ren had never heard from her, a whine with a question in it. He did not tell her it was fine. He did not know if it was fine.</w:t>
+      </w:r>
+    </w:p>
+    <w:p>
+      <w:pPr>
+        <w:spacing w:line="360" w:lineRule="auto" w:after="160"/>
+        <w:ind w:firstLine="403"/>
+        <w:jc w:val="both"/>
+      </w:pPr>
+      <w:r>
+        <w:rPr>
+          <w:rFonts w:ascii="Garamond" w:hAnsi="Garamond" w:eastAsia="Garamond"/>
+          <w:b w:val="0"/>
+          <w:i w:val="0"/>
+          <w:color w:val="2A241C"/>
+          <w:sz w:val="22"/>
+        </w:rPr>
+        <w:t>"Don't," Lyra said, very low. "Spirit-beasts don't bow to meat. They bow to hearths. That's a word with a queen attached." Orin had gone the particular still of a man seeing a footnote walk. "Mother Ash," he said. "The texts say she keeps the nightlands from coming into the cities by eating the overflow of our winters. The texts also say she is a story to make children stay inside. The texts, I am beginning to notice, are cowards." The wolf did not rise. The bow held, patient as the disk. Ren felt the claim in his mouth, the dominion-coin, and felt it answer something in the wolf that was not hunger. Hearth. Not weapon. A place you came to in order not to die. He had wanted to be that for Nima's fingers. He had not wanted a country to call him that.</w:t>
+      </w:r>
+    </w:p>
+    <w:p>
+      <w:pPr>
+        <w:spacing w:line="360" w:lineRule="auto" w:after="160"/>
+        <w:ind w:firstLine="403"/>
+        <w:jc w:val="both"/>
+      </w:pPr>
+      <w:r>
+        <w:rPr>
+          <w:rFonts w:ascii="Garamond" w:hAnsi="Garamond" w:eastAsia="Garamond"/>
+          <w:b w:val="0"/>
+          <w:i w:val="0"/>
+          <w:color w:val="2A241C"/>
+          <w:sz w:val="22"/>
+        </w:rPr>
+        <w:t xml:space="preserve">The voice did not come from the wolf's mouth. It came from the rime, from the gray un-trees, from the fill of Cinder's little holes, from the cavity-scatter Lyra had made, a woman's voice if a woman were a season. Soft. Not Solenne's soft, which was a roof. This was a bed of coals under ash, old, tended, waiting. </w:t>
+      </w:r>
+      <w:r>
+        <w:rPr>
+          <w:rFonts w:ascii="Garamond" w:hAnsi="Garamond" w:eastAsia="Garamond"/>
+          <w:b w:val="0"/>
+          <w:i/>
+          <w:color w:val="2A241C"/>
+          <w:sz w:val="22"/>
+        </w:rPr>
+        <w:t>Come, little hearth,</w:t>
+      </w:r>
+      <w:r>
+        <w:rPr>
+          <w:rFonts w:ascii="Garamond" w:hAnsi="Garamond" w:eastAsia="Garamond"/>
+          <w:b w:val="0"/>
+          <w:i w:val="0"/>
+          <w:color w:val="2A241C"/>
+          <w:sz w:val="22"/>
+        </w:rPr>
+        <w:t xml:space="preserve"> it said. Not a shout. An invitation with the weight of a road already under his feet. </w:t>
+      </w:r>
+      <w:r>
+        <w:rPr>
+          <w:rFonts w:ascii="Garamond" w:hAnsi="Garamond" w:eastAsia="Garamond"/>
+          <w:b w:val="0"/>
+          <w:i/>
+          <w:color w:val="2A241C"/>
+          <w:sz w:val="22"/>
+        </w:rPr>
+        <w:t>You are spending yourself on locks and nets. I have a house that does not nail. Come.</w:t>
+      </w:r>
+    </w:p>
+    <w:p>
+      <w:pPr>
+        <w:spacing w:line="360" w:lineRule="auto" w:after="160"/>
+        <w:ind w:firstLine="403"/>
+        <w:jc w:val="both"/>
+      </w:pPr>
+      <w:r>
+        <w:rPr>
+          <w:rFonts w:ascii="Garamond" w:hAnsi="Garamond" w:eastAsia="Garamond"/>
+          <w:b w:val="0"/>
+          <w:i w:val="0"/>
+          <w:color w:val="2A241C"/>
+          <w:sz w:val="22"/>
+        </w:rPr>
+        <w:t xml:space="preserve">He waited for the rest of the sermon. There was no rest. Solenne would have given him doctrine and a tablet and a reason the dying were arithmetic. This voice had said </w:t>
+      </w:r>
+      <w:r>
+        <w:rPr>
+          <w:rFonts w:ascii="Garamond" w:hAnsi="Garamond" w:eastAsia="Garamond"/>
+          <w:b w:val="0"/>
+          <w:i/>
+          <w:color w:val="2A241C"/>
+          <w:sz w:val="22"/>
+        </w:rPr>
+        <w:t>hearth</w:t>
+      </w:r>
+      <w:r>
+        <w:rPr>
+          <w:rFonts w:ascii="Garamond" w:hAnsi="Garamond" w:eastAsia="Garamond"/>
+          <w:b w:val="0"/>
+          <w:i w:val="0"/>
+          <w:color w:val="2A241C"/>
+          <w:sz w:val="22"/>
+        </w:rPr>
+        <w:t xml:space="preserve"> and </w:t>
+      </w:r>
+      <w:r>
+        <w:rPr>
+          <w:rFonts w:ascii="Garamond" w:hAnsi="Garamond" w:eastAsia="Garamond"/>
+          <w:b w:val="0"/>
+          <w:i/>
+          <w:color w:val="2A241C"/>
+          <w:sz w:val="22"/>
+        </w:rPr>
+        <w:t>house</w:t>
+      </w:r>
+      <w:r>
+        <w:rPr>
+          <w:rFonts w:ascii="Garamond" w:hAnsi="Garamond" w:eastAsia="Garamond"/>
+          <w:b w:val="0"/>
+          <w:i w:val="0"/>
+          <w:color w:val="2A241C"/>
+          <w:sz w:val="22"/>
+        </w:rPr>
+        <w:t xml:space="preserve"> and stopped, as if stopping were a kind of respect. The wolf's bow did not tremble. Orin's breath made a little useless cloud. Lyra had the sabers in the low guard that meant she was willing to cut a queen and had not yet decided the angle. Ren felt, under the split, the Primordial Calor lean toward the voice the way it had leaned toward the disk, not quite the same hunger. The disk wanted to be looked at. The voice wanted him to sit. Sitting had always been the thing he was worst at.</w:t>
+      </w:r>
+    </w:p>
+    <w:p>
+      <w:pPr>
+        <w:spacing w:line="360" w:lineRule="auto" w:after="160"/>
+        <w:ind w:firstLine="403"/>
+        <w:jc w:val="both"/>
+      </w:pPr>
+      <w:r>
+        <w:rPr>
+          <w:rFonts w:ascii="Garamond" w:hAnsi="Garamond" w:eastAsia="Garamond"/>
+          <w:b w:val="0"/>
+          <w:i w:val="0"/>
+          <w:color w:val="2A241C"/>
+          <w:sz w:val="22"/>
+        </w:rPr>
+        <w:t>Ren looked at Lyra and at Orin and at the bowed wolf and at the dog who had decided every other direction of his life. The Hollow Sun sat over the pale and did not comment. He could refuse. He had voted no at the Kiln and gone anyway. He had voted no at the waste-lip and gone anyway. The pattern was not lost on him. He put his cooked palm out, not on the wolf, on the air between, and the rime under the wolf's chest warmed a coin-sized circle, a crumb of yes. The wolf rose. The hollows in the line beyond the rise parted as if a street had remembered how. Lyra swore without heat. Orin adjusted the satchel, which was his way of agreeing to a theology he had not been graded on.</w:t>
+      </w:r>
+    </w:p>
+    <w:p>
+      <w:pPr>
+        <w:spacing w:line="360" w:lineRule="auto" w:after="160"/>
+        <w:ind w:firstLine="403"/>
+        <w:jc w:val="both"/>
+      </w:pPr>
+      <w:r>
+        <w:rPr>
+          <w:rFonts w:ascii="Garamond" w:hAnsi="Garamond" w:eastAsia="Garamond"/>
+          <w:b w:val="0"/>
+          <w:i w:val="0"/>
+          <w:color w:val="2A241C"/>
+          <w:sz w:val="22"/>
+        </w:rPr>
+        <w:t xml:space="preserve">"If she tries to put a crown on you I will cut it," Lyra said. "If she tries to put a collar on you I will cut that too. I am consistent. It's one of my few qualities." Ren said, "If I was a hearth I'd have better furniture." The wolf turned and started walking into the pale, not looking back, sure of the road the voice had put under them. Cinder followed the wolf at a distance that was not trust and not not-trust, the three-beat going, and Ren went because the people he would not leave were going, and because the word </w:t>
+      </w:r>
+      <w:r>
+        <w:rPr>
+          <w:rFonts w:ascii="Garamond" w:hAnsi="Garamond" w:eastAsia="Garamond"/>
+          <w:b w:val="0"/>
+          <w:i/>
+          <w:color w:val="2A241C"/>
+          <w:sz w:val="22"/>
+        </w:rPr>
+        <w:t>hearth</w:t>
+      </w:r>
+      <w:r>
+        <w:rPr>
+          <w:rFonts w:ascii="Garamond" w:hAnsi="Garamond" w:eastAsia="Garamond"/>
+          <w:b w:val="0"/>
+          <w:i w:val="0"/>
+          <w:color w:val="2A241C"/>
+          <w:sz w:val="22"/>
+        </w:rPr>
+        <w:t xml:space="preserve"> had landed in the same place the crumb had, the stubborn small heat, the thing he knew how to be even when the sky wanted him to be a lid.</w:t>
+      </w:r>
+    </w:p>
+    <w:p>
+      <w:r>
+        <w:br w:type="page"/>
+      </w:r>
+    </w:p>
+    <w:p>
+      <w:pPr>
+        <w:spacing w:after="120"/>
+        <w:jc w:val="center"/>
+      </w:pPr>
+      <w:r>
+        <w:rPr>
+          <w:rFonts w:ascii="Garamond" w:hAnsi="Garamond" w:eastAsia="Garamond"/>
+          <w:b w:val="0"/>
+          <w:i w:val="0"/>
+          <w:color w:val="8A6230"/>
+          <w:sz w:val="22"/>
+        </w:rPr>
+        <w:t>CHAPTER 10</w:t>
+      </w:r>
+    </w:p>
+    <w:p>
+      <w:pPr>
+        <w:spacing w:after="440"/>
+        <w:jc w:val="center"/>
+      </w:pPr>
+      <w:r>
+        <w:rPr>
+          <w:rFonts w:ascii="Garamond" w:hAnsi="Garamond" w:eastAsia="Garamond"/>
+          <w:b w:val="0"/>
+          <w:i w:val="0"/>
+          <w:color w:val="2A241C"/>
+          <w:sz w:val="44"/>
+        </w:rPr>
+        <w:t>The Queen of Frost</w:t>
+      </w:r>
+    </w:p>
+    <w:p>
+      <w:pPr>
+        <w:spacing w:line="360" w:lineRule="auto" w:after="160"/>
+        <w:ind w:firstLine="0"/>
+        <w:jc w:val="both"/>
+      </w:pPr>
+      <w:r>
+        <w:rPr>
+          <w:rFonts w:ascii="Garamond" w:hAnsi="Garamond" w:eastAsia="Garamond"/>
+          <w:b w:val="0"/>
+          <w:i w:val="0"/>
+          <w:color w:val="2A241C"/>
+          <w:sz w:val="22"/>
+        </w:rPr>
+        <w:t>Mother Ash took the wolf's report in the doorway because a queen who sat while a hearth approached was a queen who had already started lying. The ice-hall's threshold was packed snow over older stone, the same wound-rock as the wells, and she had kept it for a thousand years the way you kept a coal under ash: not dead, not showing. The wolf laid its too-many-jointed chest on the crust and gave her the smell of the boy, gold and street and dog and a lattice that did not debit. She put her palm on the wolf's skull, which was a courtesy, and looked past it into the pale where three figures and a three-legged animal were still deciding whether a road was a trap.</w:t>
+      </w:r>
+    </w:p>
+    <w:p>
+      <w:pPr>
+        <w:spacing w:line="360" w:lineRule="auto" w:after="160"/>
+        <w:ind w:firstLine="403"/>
+        <w:jc w:val="both"/>
+      </w:pPr>
+      <w:r>
+        <w:rPr>
+          <w:rFonts w:ascii="Garamond" w:hAnsi="Garamond" w:eastAsia="Garamond"/>
+          <w:b w:val="0"/>
+          <w:i w:val="0"/>
+          <w:color w:val="2A241C"/>
+          <w:sz w:val="22"/>
+        </w:rPr>
+        <w:t>She had not been a woman when the sun was alive. She had been a weather that had learned a name. The god's living eye had made noon a law, and law had fallen where he gazed, and the places he did not love had been nightlands even then, only no one had called them a country. When he died he left his heat in the ground like a corpse leaving warmth in a bed, and men had bottled the bed. She had taken the frost that the bottling made and made a house of it. Not a revenge. A remainder. The hollow beasts were her failures, cavities that had wanted to be hearths and had learned only hunger. The boy coming up her road was not a failure yet. He was a coal that had gotten up and walked, and the disk in the sky had twitched when he claimed a door, and she had felt that twitch in every rime-grain of her hall.</w:t>
+      </w:r>
+    </w:p>
+    <w:p>
+      <w:pPr>
+        <w:spacing w:line="360" w:lineRule="auto" w:after="160"/>
+        <w:ind w:firstLine="403"/>
+        <w:jc w:val="both"/>
+      </w:pPr>
+      <w:r>
+        <w:rPr>
+          <w:rFonts w:ascii="Garamond" w:hAnsi="Garamond" w:eastAsia="Garamond"/>
+          <w:b w:val="0"/>
+          <w:i w:val="0"/>
+          <w:color w:val="2A241C"/>
+          <w:sz w:val="22"/>
+        </w:rPr>
+        <w:t>A hearth was a thing you came to. A sun was a thing that came to you whether you asked. She had watched five vessels before this one try to be suns. Four of them had believed the Church's word for thief and had burned in chapels. One had believed his own kindness and had warmed three fountains and died with a woman's hands on his chest. None of them had been offered a house that did not nail. She was offering it now because the sixth had a dog that walked on three legs and had pinched a noon instead of spending a city, and because the disk was dreaming louder than it had since the death, and because she was tired of being only the remainder of a god's bad posture.</w:t>
+      </w:r>
+    </w:p>
+    <w:p>
+      <w:pPr>
+        <w:spacing w:line="360" w:lineRule="auto" w:after="160"/>
+        <w:ind w:firstLine="403"/>
+        <w:jc w:val="both"/>
+      </w:pPr>
+      <w:r>
+        <w:rPr>
+          <w:rFonts w:ascii="Garamond" w:hAnsi="Garamond" w:eastAsia="Garamond"/>
+          <w:b w:val="0"/>
+          <w:i w:val="0"/>
+          <w:color w:val="2A241C"/>
+          <w:sz w:val="22"/>
+        </w:rPr>
+        <w:t>The woman with the sabers would cut her if the offer smelled like a collar. Mother Ash found that she did not mind. Collars were a sun's habit. She had worn the god's gaze once, in the years when looking was weather, and she had learned the shape of being owned so that she would not reproduce it. The Hale boy's grief was a closed room in him; she could smell the sister on the scarf in the satchel, frost that had sat too long in a west wing. Grief made people want lids. She would have to watch that one. The dog she trusted already.</w:t>
+      </w:r>
+    </w:p>
+    <w:p>
+      <w:pPr>
+        <w:spacing w:line="360" w:lineRule="auto" w:after="160"/>
+        <w:ind w:firstLine="403"/>
+        <w:jc w:val="both"/>
+      </w:pPr>
+      <w:r>
+        <w:rPr>
+          <w:rFonts w:ascii="Garamond" w:hAnsi="Garamond" w:eastAsia="Garamond"/>
+          <w:b w:val="0"/>
+          <w:i w:val="0"/>
+          <w:color w:val="2A241C"/>
+          <w:sz w:val="22"/>
+        </w:rPr>
+        <w:t>They reached the threshold with the woman's sabers out and the fallen noble's satchel clutched like a thesis and the boy trying not to look like a door. Mother Ash did not bow. Queens who bowed to hearths made hearths into thrones by accident. She stood aside, which was the older courtesy, and the ice-hall took them in with a temperature that was not warmth and not the waste's honesty, a held in-between, coals banked under a crust of ash in basins of black stone. Frost-spirits along the walls dimmed themselves to be polite, faces like breath on glass, not quite eyes. The three-legged dog sniffed a basin and then sat on the boy's foot, claiming him in a language Mother Ash respected more than psalms.</w:t>
+      </w:r>
+    </w:p>
+    <w:p>
+      <w:pPr>
+        <w:spacing w:line="360" w:lineRule="auto" w:after="160"/>
+        <w:ind w:firstLine="403"/>
+        <w:jc w:val="both"/>
+      </w:pPr>
+      <w:r>
+        <w:rPr>
+          <w:rFonts w:ascii="Garamond" w:hAnsi="Garamond" w:eastAsia="Garamond"/>
+          <w:b w:val="0"/>
+          <w:i w:val="0"/>
+          <w:color w:val="2A241C"/>
+          <w:sz w:val="22"/>
+        </w:rPr>
+        <w:t>"You can stay," she said. The hall carried her voice without echo, which was a trick of packed snow and practice. "If you will not restore a sun that owns. The last one looked, and looking was a law, and the law burned the unloved and fattened the gazed-upon, and when he died the gazed-upon learned to sew shards into chests and call it succession. I will not keep a hearth that wants to be that lid. I will keep a hearth that people can walk to and walk away from. Sanctuary, little one. Not a crown. Not a chapel. A house. The disk will hate it. The Church will hate it. I am old enough to be hated by both."</w:t>
+      </w:r>
+    </w:p>
+    <w:p>
+      <w:pPr>
+        <w:spacing w:line="360" w:lineRule="auto" w:after="160"/>
+        <w:ind w:firstLine="403"/>
+        <w:jc w:val="both"/>
+      </w:pPr>
+      <w:r>
+        <w:rPr>
+          <w:rFonts w:ascii="Garamond" w:hAnsi="Garamond" w:eastAsia="Garamond"/>
+          <w:b w:val="0"/>
+          <w:i w:val="0"/>
+          <w:color w:val="2A241C"/>
+          <w:sz w:val="22"/>
+        </w:rPr>
+        <w:t>She watched his face do the slum thing, inventory, cost, the same look he had probably given crumbs. The woman inquisitor was already finding exits. The Hale boy was finding categories. The dog was finding whether the basins could be stolen. Mother Ash felt the Primordial Calor in the split of his ribs turn toward her like a cat toward a stove, and felt, farther up, the Hollow Sun's dead attention lean in, a dream noticing it was being dreamed. She did not reach for either. Reaching was how you became a lid. She waited. Waiting was how you became a house.</w:t>
+      </w:r>
+    </w:p>
+    <w:p>
+      <w:pPr>
+        <w:jc w:val="center"/>
+      </w:pPr>
+      <w:r>
+        <w:rPr>
+          <w:rFonts w:ascii="Garamond" w:hAnsi="Garamond" w:eastAsia="Garamond"/>
+          <w:b w:val="0"/>
+          <w:i w:val="0"/>
+          <w:color w:val="8A6230"/>
+          <w:sz w:val="24"/>
+        </w:rPr>
+        <w:t>⁂</w:t>
+      </w:r>
+    </w:p>
+    <w:p>
+      <w:pPr>
+        <w:spacing w:line="360" w:lineRule="auto" w:after="160"/>
+        <w:ind w:firstLine="0"/>
+        <w:jc w:val="both"/>
+      </w:pPr>
+      <w:r>
+        <w:rPr>
+          <w:rFonts w:ascii="Garamond" w:hAnsi="Garamond" w:eastAsia="Garamond"/>
+          <w:b w:val="0"/>
+          <w:i w:val="0"/>
+          <w:color w:val="2A241C"/>
+          <w:sz w:val="22"/>
+        </w:rPr>
+        <w:t>Ren had expected a queen to look like a warrant. She looked like a tall woman who had stood too close to a kiln for a thousand years and then walked out into snow, ash still in the seams of her, eyes the dull red of banked coals, a coat that might have been frost packed until it remembered cloth. The hall was a held breath. The basins gave off a heat you could put your hands to without being owned by it. He hated how much he wanted to sit. Sitting was how they nailed you. Lyra had said that and had been right and was now at his left with the sabers not quite down, which was her way of sitting.</w:t>
+      </w:r>
+    </w:p>
+    <w:p>
+      <w:pPr>
+        <w:spacing w:line="360" w:lineRule="auto" w:after="160"/>
+        <w:ind w:firstLine="403"/>
+        <w:jc w:val="both"/>
+      </w:pPr>
+      <w:r>
+        <w:rPr>
+          <w:rFonts w:ascii="Garamond" w:hAnsi="Garamond" w:eastAsia="Garamond"/>
+          <w:b w:val="0"/>
+          <w:i w:val="0"/>
+          <w:color w:val="2A241C"/>
+          <w:sz w:val="22"/>
+        </w:rPr>
+        <w:t>He walked the hall once because you did not accept a house you had not checked for grates. The walls were snow that did not drip. The spirits along them watched the way kiln-bricks watched, interested, not kind. No wax. No notices. No null-charms. A long table that had been grown more than built, with bowls of something dark that steamed like broth and might have been broth if he was willing to be an idiot. Cinder was willing. He hooked two fingers in her ruff and kept her from the bowls until someone who had been weather said it was allowed. No one had yet.</w:t>
+      </w:r>
+    </w:p>
+    <w:p>
+      <w:pPr>
+        <w:spacing w:line="360" w:lineRule="auto" w:after="160"/>
+        <w:ind w:firstLine="403"/>
+        <w:jc w:val="both"/>
+      </w:pPr>
+      <w:r>
+        <w:rPr>
+          <w:rFonts w:ascii="Garamond" w:hAnsi="Garamond" w:eastAsia="Garamond"/>
+          <w:b w:val="0"/>
+          <w:i w:val="0"/>
+          <w:color w:val="2A241C"/>
+          <w:sz w:val="22"/>
+        </w:rPr>
+        <w:t xml:space="preserve">"Say the condition again," he said. "Slower. I drop things." Mother Ash's mouth moved in what might have been a smile if smiles were a weather. "Sanctuary if you will not restore sun-tyranny. No noon that belongs to a god, a church, a house, a saint with a needle in his chest, or you. Heat that people can come to. Heat they can leave. You have already been a crumb in a kiln. I am asking you to be that on purpose, and larger, and not a lid." Orin made a small wounded sound at </w:t>
+      </w:r>
+      <w:r>
+        <w:rPr>
+          <w:rFonts w:ascii="Garamond" w:hAnsi="Garamond" w:eastAsia="Garamond"/>
+          <w:b w:val="0"/>
+          <w:i/>
+          <w:color w:val="2A241C"/>
+          <w:sz w:val="22"/>
+        </w:rPr>
+        <w:t>not a lid</w:t>
+      </w:r>
+      <w:r>
+        <w:rPr>
+          <w:rFonts w:ascii="Garamond" w:hAnsi="Garamond" w:eastAsia="Garamond"/>
+          <w:b w:val="0"/>
+          <w:i w:val="0"/>
+          <w:color w:val="2A241C"/>
+          <w:sz w:val="22"/>
+        </w:rPr>
+        <w:t>, because his three-year lattice had been a lid of a kind and he knew it. Lyra said, "And if he says no, we walk back into the waste and you eat us." "If he says no," Mother Ash said, "you walk back and I do not help the Church find you. I am not them. That is the entire sermon."</w:t>
+      </w:r>
+    </w:p>
+    <w:p>
+      <w:pPr>
+        <w:spacing w:line="360" w:lineRule="auto" w:after="160"/>
+        <w:ind w:firstLine="403"/>
+        <w:jc w:val="both"/>
+      </w:pPr>
+      <w:r>
+        <w:rPr>
+          <w:rFonts w:ascii="Garamond" w:hAnsi="Garamond" w:eastAsia="Garamond"/>
+          <w:b w:val="0"/>
+          <w:i w:val="0"/>
+          <w:color w:val="2A241C"/>
+          <w:sz w:val="22"/>
+        </w:rPr>
+        <w:t>Ren thought of Cassian Vale steaming on feast days, a legal sun on a string. He thought of Solenne's net on other people's wrists. He thought of the Kiln and the eleven marks and Nima's fingers in his mouth, disgusting and it worked. He thought of the dominion-coin in his teeth, the lock agreeing to be his, the weight of the disk on his neck. A sun that belonged to him would still be a sun that belonged. The children would come to look. The troughs would freeze on a schedule. Lyra's cage, with better furniture. He did not want furniture. He wanted Toma to steal and Nima to stop wrapping wool and Cinder to sleep on a brick that was warm because the day was, not because he was a stove nailed to it.</w:t>
+      </w:r>
+    </w:p>
+    <w:p>
+      <w:pPr>
+        <w:spacing w:line="360" w:lineRule="auto" w:after="160"/>
+        <w:ind w:firstLine="403"/>
+        <w:jc w:val="both"/>
+      </w:pPr>
+      <w:r>
+        <w:rPr>
+          <w:rFonts w:ascii="Garamond" w:hAnsi="Garamond" w:eastAsia="Garamond"/>
+          <w:b w:val="0"/>
+          <w:i w:val="0"/>
+          <w:color w:val="2A241C"/>
+          <w:sz w:val="22"/>
+        </w:rPr>
+        <w:t>"All right," he said. He did not put his hand out. Oaths with hands were Church. He stood in the hall with his cooked palms open at his sides and Cinder's weight on his foot and he made the words as plain as a crumb. "No sun that belongs to anyone. Not me. Not them. Not a god who gets back up. If I light anything it stays a place you can walk away from. If I forget, you can remind me. If I forget on purpose, she can cut it." He tipped his head at Lyra. She did not argue. She looked at Mother Ash as if they had just become an ugly committee and she would live.</w:t>
+      </w:r>
+    </w:p>
+    <w:p>
+      <w:pPr>
+        <w:spacing w:line="360" w:lineRule="auto" w:after="160"/>
+        <w:ind w:firstLine="403"/>
+        <w:jc w:val="both"/>
+      </w:pPr>
+      <w:r>
+        <w:rPr>
+          <w:rFonts w:ascii="Garamond" w:hAnsi="Garamond" w:eastAsia="Garamond"/>
+          <w:b w:val="0"/>
+          <w:i w:val="0"/>
+          <w:color w:val="2A241C"/>
+          <w:sz w:val="22"/>
+        </w:rPr>
+        <w:t>The split on his ribs ticked once, hard. Up through the ice-hall's roof, through the pale, the black disk did something too small to be a movement and too large to be nothing, a dream's twitch. Orin looked at the ceiling as if the ceiling had insulted his notes. Mother Ash closed her eyes, banked-coal dull, and when she opened them the hall's in-between warmth sat a degree closer to a held hand. "Kept," she said. "Sleep. The house will not nail the doors. Your Church is already putting a hunting party on the waste, and your disk is learning your name, and you will need a noon you can start and stop if you want the oath to survive its first week." Ren sat because Cinder sat, and because the basin's heat did not ask him to sign, and because he had just promised the world a sun with no owner and the world, he was fairly sure, did not know how to want that yet.</w:t>
+      </w:r>
+    </w:p>
+    <w:p>
+      <w:r>
+        <w:br w:type="page"/>
+      </w:r>
+    </w:p>
+    <w:p>
+      <w:pPr>
+        <w:spacing w:after="120"/>
+        <w:jc w:val="center"/>
+      </w:pPr>
+      <w:r>
+        <w:rPr>
+          <w:rFonts w:ascii="Garamond" w:hAnsi="Garamond" w:eastAsia="Garamond"/>
+          <w:b w:val="0"/>
+          <w:i w:val="0"/>
+          <w:color w:val="8A6230"/>
+          <w:sz w:val="22"/>
+        </w:rPr>
+        <w:t>CHAPTER 11</w:t>
+      </w:r>
+    </w:p>
+    <w:p>
+      <w:pPr>
+        <w:spacing w:after="440"/>
+        <w:jc w:val="center"/>
+      </w:pPr>
+      <w:r>
+        <w:rPr>
+          <w:rFonts w:ascii="Garamond" w:hAnsi="Garamond" w:eastAsia="Garamond"/>
+          <w:b w:val="0"/>
+          <w:i w:val="0"/>
+          <w:color w:val="2A241C"/>
+          <w:sz w:val="44"/>
+        </w:rPr>
+        <w:t>The Dreaming Eye</w:t>
+      </w:r>
+    </w:p>
+    <w:p>
+      <w:pPr>
+        <w:spacing w:line="360" w:lineRule="auto" w:after="160"/>
+        <w:ind w:firstLine="0"/>
+        <w:jc w:val="both"/>
+      </w:pPr>
+      <w:r>
+        <w:rPr>
+          <w:rFonts w:ascii="Garamond" w:hAnsi="Garamond" w:eastAsia="Garamond"/>
+          <w:b w:val="0"/>
+          <w:i w:val="0"/>
+          <w:color w:val="2A241C"/>
+          <w:sz w:val="22"/>
+        </w:rPr>
+        <w:t>Sleep in the ice-hall was a basin and a dog and a promise still sitting in his mouth like a coin. Ren lay on packed snow that did not bite, Cinder a three-legged furnace against his stomach, and the split on his ribs ticked in a rhythm that was not his pulse. He shut his eyes because Mother Ash had said sleep, and because Lyra had said she would cut him if he tried to hold a noon indoors, and because Orin was already asleep sitting up with the satchel in his lap like a child with a thesis. The dark behind Ren's eyes was not dark. It was lid-light. The disk came in without a door.</w:t>
+      </w:r>
+    </w:p>
+    <w:p>
+      <w:pPr>
+        <w:spacing w:line="360" w:lineRule="auto" w:after="160"/>
+        <w:ind w:firstLine="403"/>
+        <w:jc w:val="both"/>
+      </w:pPr>
+      <w:r>
+        <w:rPr>
+          <w:rFonts w:ascii="Garamond" w:hAnsi="Garamond" w:eastAsia="Garamond"/>
+          <w:b w:val="0"/>
+          <w:i w:val="0"/>
+          <w:color w:val="2A241C"/>
+          <w:sz w:val="22"/>
+        </w:rPr>
+        <w:t>He did not sit up. Sitting up would have been a body. This was the other direction. The hall fell away in a clean drop that did not wind him, and he was standing on nothing that felt like the Wellgate's bronze from the inside, a dark curve, warm as a held hand and wrong as a mouth. The Hollow Sun was around him. Not above. Around. A room the size of looking. In the middle of the room a fire had been banked so long it had forgotten the word for flame, coals under a crust, the same trick as Mother Ash's basins and older. He walked toward it because walking was what he had. His boots made no sound. Cinder was not here. That was how he knew it was not mercy.</w:t>
+      </w:r>
+    </w:p>
+    <w:p>
+      <w:pPr>
+        <w:spacing w:line="360" w:lineRule="auto" w:after="160"/>
+        <w:ind w:firstLine="403"/>
+        <w:jc w:val="both"/>
+      </w:pPr>
+      <w:r>
+        <w:rPr>
+          <w:rFonts w:ascii="Garamond" w:hAnsi="Garamond" w:eastAsia="Garamond"/>
+          <w:b w:val="0"/>
+          <w:i w:val="0"/>
+          <w:color w:val="2A241C"/>
+          <w:sz w:val="22"/>
+        </w:rPr>
+        <w:t>The curve under his feet had the sag of the Wellgate's disk, the place where a saint's face had run. He did not like that. He had cooked eight men and a gate and he had not been invited to live inside the souvenir. Far off, if far was a word here, the bronze went to black and the black went to the idea of a sky under a sky. He kept his eyes on the coals. Looking at the edge felt like looking at the Hollow Sun from Cinderrow, the thing you did not do because it did not make anything warmer.</w:t>
+      </w:r>
+    </w:p>
+    <w:p>
+      <w:pPr>
+        <w:spacing w:line="360" w:lineRule="auto" w:after="160"/>
+        <w:ind w:firstLine="403"/>
+        <w:jc w:val="both"/>
+      </w:pPr>
+      <w:r>
+        <w:rPr>
+          <w:rFonts w:ascii="Garamond" w:hAnsi="Garamond" w:eastAsia="Garamond"/>
+          <w:b w:val="0"/>
+          <w:i w:val="0"/>
+          <w:color w:val="2A241C"/>
+          <w:sz w:val="22"/>
+        </w:rPr>
+        <w:t>The coals had an eye in them, or the idea of an eye, closed. A lid on a lid. He understood, without being taught and without liking it, that he was not visiting. He was the heat that had gotten loose from the bank and grown a street name and a dog. Primordial Calor. The leftover. A dream the dead god was still having, a thousand years on, of being warm in a body. The copies, the shield, the net, the lattice, the dominion at the lock: those had not been thefts. They had been the dream noticing the room it was in. Lucidity. He had been becoming lucid since the brand split, and the disk had twitched because a dream that knows it is a dream starts to wake the sleeper.</w:t>
+      </w:r>
+    </w:p>
+    <w:p>
+      <w:pPr>
+        <w:spacing w:line="360" w:lineRule="auto" w:after="160"/>
+        <w:ind w:firstLine="403"/>
+        <w:jc w:val="both"/>
+      </w:pPr>
+      <w:r>
+        <w:rPr>
+          <w:rFonts w:ascii="Garamond" w:hAnsi="Garamond" w:eastAsia="Garamond"/>
+          <w:b w:val="0"/>
+          <w:i w:val="0"/>
+          <w:color w:val="2A241C"/>
+          <w:sz w:val="22"/>
+        </w:rPr>
+        <w:t>He put his hand out to the banked coals the way he had put it out to the crumb. The crust was the same cloudy white. A tooth. A pip. He did not swallow. Swallowing would have been a yes with no edge. The closed eye under the crust warmed to his palm and did not open, and a pressure came up through the bronze-dark that was not a voice and was not not a voice, the stare from the tannery lane given a room to live in. If he pushed, the eye would open. If the eye opened, noon would belong to a god again, a lid that looked, a law that fell where it gazed. He had just sworn against that in a hall with a queen and a woman who cut collars. The oath sat in his mouth in here too. He kept his palm where it was and did not push.</w:t>
+      </w:r>
+    </w:p>
+    <w:p>
+      <w:pPr>
+        <w:spacing w:line="360" w:lineRule="auto" w:after="160"/>
+        <w:ind w:firstLine="403"/>
+        <w:jc w:val="both"/>
+      </w:pPr>
+      <w:r>
+        <w:rPr>
+          <w:rFonts w:ascii="Garamond" w:hAnsi="Garamond" w:eastAsia="Garamond"/>
+          <w:b w:val="0"/>
+          <w:i w:val="0"/>
+          <w:color w:val="2A241C"/>
+          <w:sz w:val="22"/>
+        </w:rPr>
+        <w:t xml:space="preserve">Lucid was a lonely temperature. He could see, along the curve of the room, other banked places, six of them, dimmer, as if someone had sealed coals under stone and left them to dream smaller dreams. He did not go to them. He did not have the name for them yet and refused to invent one. The sleeper's attention slid over him like a hand over a grate, curious, huge, not kind, not cruel, the way weather was not cruel. </w:t>
+      </w:r>
+      <w:r>
+        <w:rPr>
+          <w:rFonts w:ascii="Garamond" w:hAnsi="Garamond" w:eastAsia="Garamond"/>
+          <w:b w:val="0"/>
+          <w:i/>
+          <w:color w:val="2A241C"/>
+          <w:sz w:val="22"/>
+        </w:rPr>
+        <w:t>You,</w:t>
+      </w:r>
+      <w:r>
+        <w:rPr>
+          <w:rFonts w:ascii="Garamond" w:hAnsi="Garamond" w:eastAsia="Garamond"/>
+          <w:b w:val="0"/>
+          <w:i w:val="0"/>
+          <w:color w:val="2A241C"/>
+          <w:sz w:val="22"/>
+        </w:rPr>
+        <w:t xml:space="preserve"> it meant, if meaning could be a heat. </w:t>
+      </w:r>
+      <w:r>
+        <w:rPr>
+          <w:rFonts w:ascii="Garamond" w:hAnsi="Garamond" w:eastAsia="Garamond"/>
+          <w:b w:val="0"/>
+          <w:i/>
+          <w:color w:val="2A241C"/>
+          <w:sz w:val="22"/>
+        </w:rPr>
+        <w:t>You are the part that stood up.</w:t>
+      </w:r>
+      <w:r>
+        <w:rPr>
+          <w:rFonts w:ascii="Garamond" w:hAnsi="Garamond" w:eastAsia="Garamond"/>
+          <w:b w:val="0"/>
+          <w:i w:val="0"/>
+          <w:color w:val="2A241C"/>
+          <w:sz w:val="22"/>
+        </w:rPr>
+        <w:t xml:space="preserve"> He said, in the Kiln voice, the one he used on Toma when Toma was about to be brave, "Stay down. If you get up you become everyone else's problem, and I am already a problem, and the line is long." The eye did not open. The crust cracked a hair. Gold showed, then hid. He took his hand off.</w:t>
+      </w:r>
+    </w:p>
+    <w:p>
+      <w:pPr>
+        <w:spacing w:line="360" w:lineRule="auto" w:after="160"/>
+        <w:ind w:firstLine="403"/>
+        <w:jc w:val="both"/>
+      </w:pPr>
+      <w:r>
+        <w:rPr>
+          <w:rFonts w:ascii="Garamond" w:hAnsi="Garamond" w:eastAsia="Garamond"/>
+          <w:b w:val="0"/>
+          <w:i w:val="0"/>
+          <w:color w:val="2A241C"/>
+          <w:sz w:val="22"/>
+        </w:rPr>
+        <w:t>Getting out was harder than falling in. The room wanted him to keep walking it. Lucid dreams did. He thought of Cinder's stump on his boot, of Nima's bread-dust in his palm, of Lyra saying the nightlands were honest, of Orin's scorch-circles, of a queen who had stood aside instead of bowing. The bronze-dark thinned. The basin came back. The dog's breath. He dragged in air that hurt because it was his.</w:t>
+      </w:r>
+    </w:p>
+    <w:p>
+      <w:pPr>
+        <w:spacing w:line="360" w:lineRule="auto" w:after="160"/>
+        <w:ind w:firstLine="403"/>
+        <w:jc w:val="both"/>
+      </w:pPr>
+      <w:r>
+        <w:rPr>
+          <w:rFonts w:ascii="Garamond" w:hAnsi="Garamond" w:eastAsia="Garamond"/>
+          <w:b w:val="0"/>
+          <w:i w:val="0"/>
+          <w:color w:val="2A241C"/>
+          <w:sz w:val="22"/>
+        </w:rPr>
+        <w:t>Lyra was sitting against the basin with both sabers across her knees and her eyes on his mouth. She looked like she had been there as long as the coals had. The ash-coat was buttoned, which meant she was cold and not admitting it. "Welcome back," she said. "You were gold from the throat up. I did not put a seal on you. I thought about it for a professional hour and then I thought about chapels. You're welcome." Cinder licked his jaw, the rude valve. Orin was awake now, notes half out, face doing the hunger-and-insult. Ren sat up and the hall stayed a hall. His palm had a white mark on it, cloudy, the size of a tooth, already fading.</w:t>
+      </w:r>
+    </w:p>
+    <w:p>
+      <w:pPr>
+        <w:spacing w:line="360" w:lineRule="auto" w:after="160"/>
+        <w:ind w:firstLine="403"/>
+        <w:jc w:val="both"/>
+      </w:pPr>
+      <w:r>
+        <w:rPr>
+          <w:rFonts w:ascii="Garamond" w:hAnsi="Garamond" w:eastAsia="Garamond"/>
+          <w:b w:val="0"/>
+          <w:i w:val="0"/>
+          <w:color w:val="2A241C"/>
+          <w:sz w:val="22"/>
+        </w:rPr>
+        <w:t>There was a wet cloth on the snow beside her, wrung out, pink at the edge. He had bitten his lip, then. Or she had put water on him when the gold climbed. She saw him see it and shrugged, a small ugly motion. "Vigil is a grand word for sitting on the floor refusing to let a boy cook himself into a psalm. Don't make it a habit. My knees are older than your manners." He wanted to say thank you and did not, because thank you was a receipt, and she had already told Rhel a lie without asking for one. He picked up the cloth, folded it, put it on the basin's rim. Cinder approved by ignoring the ceremony.</w:t>
+      </w:r>
+    </w:p>
+    <w:p>
+      <w:pPr>
+        <w:spacing w:line="360" w:lineRule="auto" w:after="160"/>
+        <w:ind w:firstLine="403"/>
+        <w:jc w:val="both"/>
+      </w:pPr>
+      <w:r>
+        <w:rPr>
+          <w:rFonts w:ascii="Garamond" w:hAnsi="Garamond" w:eastAsia="Garamond"/>
+          <w:b w:val="0"/>
+          <w:i w:val="0"/>
+          <w:color w:val="2A241C"/>
+          <w:sz w:val="22"/>
+        </w:rPr>
+        <w:t>"It's dreaming," he said. He did not dress it. "The disk. The god. Whatever we bottled. It's asleep and I am the dream that started knowing the room. If I go all the way lucid it opens its eye. If it opens its eye, my oath is a joke and we get a lid with opinions." Lyra's dry look held. "So don't. I have met you. You are stubborn at not doing things, except when you do them." She shifted the sabers. "I sat here because if you cooked the hall I was going to drag you into the waste and let the hollows file a complaint. Also because someone should watch a boy when he walks into a dead eye. I have failed that job before. I am not collecting another." She did not say Sera. She did not have to. He nodded, once, the loaf-broken contract, and did not make her a speech.</w:t>
+      </w:r>
+    </w:p>
+    <w:p>
+      <w:pPr>
+        <w:spacing w:line="360" w:lineRule="auto" w:after="160"/>
+        <w:ind w:firstLine="403"/>
+        <w:jc w:val="both"/>
+      </w:pPr>
+      <w:r>
+        <w:rPr>
+          <w:rFonts w:ascii="Garamond" w:hAnsi="Garamond" w:eastAsia="Garamond"/>
+          <w:b w:val="0"/>
+          <w:i w:val="0"/>
+          <w:color w:val="2A241C"/>
+          <w:sz w:val="22"/>
+        </w:rPr>
+        <w:t>Orin said, "Six dimmer banks. You said six, or you didn't, but your face said a number." He had been watching too, then, or listening in his sleep the way prodigies did. Ren shrugged. "I didn't count for you. Don't put them in a primer." Orin shut the notes. It cost him. Mother Ash was in the doorway without having walked there, ash-seamed, banked-coal eyes, the wolf at her hip. "He is becoming lucid," she said, not a question. "The house felt the crack. The disk felt it farther. You kept the eye shut. That is the oath working. It will not work by sitting. Lucid dreams that refuse to wake still have to be walked, or they rot into cavities. You will need a noon you can start and stop. A hearth's noon. Thirty heartbeats and no more, if you can count."</w:t>
+      </w:r>
+    </w:p>
+    <w:p>
+      <w:pPr>
+        <w:spacing w:line="360" w:lineRule="auto" w:after="160"/>
+        <w:ind w:firstLine="403"/>
+        <w:jc w:val="both"/>
+      </w:pPr>
+      <w:r>
+        <w:rPr>
+          <w:rFonts w:ascii="Garamond" w:hAnsi="Garamond" w:eastAsia="Garamond"/>
+          <w:b w:val="0"/>
+          <w:i w:val="0"/>
+          <w:color w:val="2A241C"/>
+          <w:sz w:val="22"/>
+        </w:rPr>
+        <w:t>The wolf's head came up before the horn did. The horn was a long way out in the pale, two-three, two-three, purge pace that had learned to be a hunting party, Rhel's math given legs and gauntlets and probably a tablet with Ren's name and Lyra's and now Hale's. A second horn answered it, wider, the sound of more than a pair. Lyra was on her feet in the same motion as the sabers. "How long." Mother Ash listened to the rime. "They will be at the rise by the cold hour. Solenne did not come herself. She sent enough that she will not have to. Null-charms on the lead. They learned from your lock." She looked at Ren. "Sanctuary is a house, not a fortress. I will not make this hall a chapel by winning it for you. You asked for a sun that belongs to no one. Go prove you can light a place and leave it. I will keep the hollows off your back. I will not keep the Church off your oath. That is yours."</w:t>
+      </w:r>
+    </w:p>
+    <w:p>
+      <w:pPr>
+        <w:spacing w:line="360" w:lineRule="auto" w:after="160"/>
+        <w:ind w:firstLine="403"/>
+        <w:jc w:val="both"/>
+      </w:pPr>
+      <w:r>
+        <w:rPr>
+          <w:rFonts w:ascii="Garamond" w:hAnsi="Garamond" w:eastAsia="Garamond"/>
+          <w:b w:val="0"/>
+          <w:i w:val="0"/>
+          <w:color w:val="2A241C"/>
+          <w:sz w:val="22"/>
+        </w:rPr>
+        <w:t>Ren stood. The tooth-mark on his palm was gone. The split ticked, interested, rude, awake the way a dream was awake. Cinder shook herself into her three-beat. Orin slung the satchel. Lyra said, "If you open that eye by accident I will hit you with the flat until lucidity looks less attractive." He almost grinned and then did not, because the horns were a fact and Nima's system of marks had no column for this. They went to the threshold, the basins at their backs, the pale in front, the disk overhead with its closed eye that he had put a hand on and not pushed. A hunting party was coming to bottle him or put him out. He had thirty heartbeats of a noon that was not supposed to belong to anyone, and he was going to have to spend them in front of men with charms, and the dream, lucid now, would be watching to see if he flinched.</w:t>
+      </w:r>
+    </w:p>
+    <w:p>
+      <w:r>
+        <w:br w:type="page"/>
+      </w:r>
+    </w:p>
+    <w:p>
+      <w:pPr>
+        <w:spacing w:after="120"/>
+        <w:jc w:val="center"/>
+      </w:pPr>
+      <w:r>
+        <w:rPr>
+          <w:rFonts w:ascii="Garamond" w:hAnsi="Garamond" w:eastAsia="Garamond"/>
+          <w:b w:val="0"/>
+          <w:i w:val="0"/>
+          <w:color w:val="8A6230"/>
+          <w:sz w:val="22"/>
+        </w:rPr>
+        <w:t>CHAPTER 12</w:t>
+      </w:r>
+    </w:p>
+    <w:p>
+      <w:pPr>
+        <w:spacing w:after="440"/>
+        <w:jc w:val="center"/>
+      </w:pPr>
+      <w:r>
+        <w:rPr>
+          <w:rFonts w:ascii="Garamond" w:hAnsi="Garamond" w:eastAsia="Garamond"/>
+          <w:b w:val="0"/>
+          <w:i w:val="0"/>
+          <w:color w:val="2A241C"/>
+          <w:sz w:val="44"/>
+        </w:rPr>
+        <w:t>Noon</w:t>
+      </w:r>
+    </w:p>
+    <w:p>
+      <w:pPr>
+        <w:spacing w:line="360" w:lineRule="auto" w:after="160"/>
+        <w:ind w:firstLine="0"/>
+        <w:jc w:val="both"/>
+      </w:pPr>
+      <w:r>
+        <w:rPr>
+          <w:rFonts w:ascii="Garamond" w:hAnsi="Garamond" w:eastAsia="Garamond"/>
+          <w:b w:val="0"/>
+          <w:i w:val="0"/>
+          <w:color w:val="2A241C"/>
+          <w:sz w:val="22"/>
+        </w:rPr>
+        <w:t>The hunting party came over the rise as a white line, purge-gauntlets already steaming in the honest cold, null-charms nailed to the lead shields like pale coins. Ren counted sixteen and then stopped counting because numbers were how the Church made people into arithmetic. Rhel was in the middle without a gauntlet, hide-coat, the loft-knife loyalty given a field to work in. He had a tablet. Of course he had a tablet. Behind Ren the ice-hall was a dark mouth in the rime, Mother Ash not in it, the wolf a pale shape off to the left where the hollows had been told to wait. Lyra took the right. Orin took the left with Glassheart already beading in his hands, the old spend, the one he still owned. Cinder sat on Ren's boot and watched the line as if it were a cart he might have to roll under.</w:t>
+      </w:r>
+    </w:p>
+    <w:p>
+      <w:pPr>
+        <w:spacing w:line="360" w:lineRule="auto" w:after="160"/>
+        <w:ind w:firstLine="403"/>
+        <w:jc w:val="both"/>
+      </w:pPr>
+      <w:r>
+        <w:rPr>
+          <w:rFonts w:ascii="Garamond" w:hAnsi="Garamond" w:eastAsia="Garamond"/>
+          <w:b w:val="0"/>
+          <w:i w:val="0"/>
+          <w:color w:val="2A241C"/>
+          <w:sz w:val="22"/>
+        </w:rPr>
+        <w:t>Rhel stopped at the distance a catch-form wanted. His voice carried in the waste the way cheap well-oil carried in a loft. "Ren Kael. Vessel. Lyra Voss, apostate. Orin Hale, absconded. You will submit to sink and seal. The Cardinal offers managed dusk and a clean name in the lists. The alternative is the one you already understand." He did not look at the dog. He had learned, at least, not to look at the dog. Lyra called back, "Tell Solenne I said the decorations are still ugly." Ren did not call anything. He was counting his own pulse in his throat, Nima's system, charcoal on a wall, a child's ledger. Thirty. Mother Ash had said thirty and no more. A hearth's noon. Start and stop. The oath with an audience.</w:t>
+      </w:r>
+    </w:p>
+    <w:p>
+      <w:pPr>
+        <w:spacing w:line="360" w:lineRule="auto" w:after="160"/>
+        <w:ind w:firstLine="403"/>
+        <w:jc w:val="both"/>
+      </w:pPr>
+      <w:r>
+        <w:rPr>
+          <w:rFonts w:ascii="Garamond" w:hAnsi="Garamond" w:eastAsia="Garamond"/>
+          <w:b w:val="0"/>
+          <w:i w:val="0"/>
+          <w:color w:val="2A241C"/>
+          <w:sz w:val="22"/>
+        </w:rPr>
+        <w:t>Orin, without looking away from the null-charms, said, "If you cook them you prove her tablet. If you run you prove it too. The only new number is a noon that ends." His voice had the manse in it, the scorch-circles, the three years. Lyra shifted her stance a thumb's width. "I can cut the lead four. After that the math is yours. Try to make it a place and not a sermon. I have heard enough sermons." Cinder yawned, which was either contempt or a strategy. Ren loved her for not knowing the difference.</w:t>
+      </w:r>
+    </w:p>
+    <w:p>
+      <w:pPr>
+        <w:spacing w:line="360" w:lineRule="auto" w:after="160"/>
+        <w:ind w:firstLine="403"/>
+        <w:jc w:val="both"/>
+      </w:pPr>
+      <w:r>
+        <w:rPr>
+          <w:rFonts w:ascii="Garamond" w:hAnsi="Garamond" w:eastAsia="Garamond"/>
+          <w:b w:val="0"/>
+          <w:i w:val="0"/>
+          <w:color w:val="2A241C"/>
+          <w:sz w:val="22"/>
+        </w:rPr>
+        <w:t>"If I come in," he said, and his voice came out slum-flat, not gold, "you put me in a chapel and walk children past on feast days. I have been told about the chapel. I vote no." Rhel's mouth did the sour thing. "Vote is not a doctrine." "It is in Cinderrow," Ren said. He stepped off the boot. Cinder came with him, three-beat, stump punching the crust. The null-charms leaned toward the split as if refusing a conversation they could already hear. He did not copy them. He did not claim a territory the size of a war. He asked the rise under his feet to be a place, the way the Kiln had been a place, the way a crumb in four pairs of hands had been a place. Come to it. Walk away from it. No owner.</w:t>
+      </w:r>
+    </w:p>
+    <w:p>
+      <w:pPr>
+        <w:spacing w:line="360" w:lineRule="auto" w:after="160"/>
+        <w:ind w:firstLine="403"/>
+        <w:jc w:val="both"/>
+      </w:pPr>
+      <w:r>
+        <w:rPr>
+          <w:rFonts w:ascii="Garamond" w:hAnsi="Garamond" w:eastAsia="Garamond"/>
+          <w:b w:val="0"/>
+          <w:i w:val="0"/>
+          <w:color w:val="2A241C"/>
+          <w:sz w:val="22"/>
+        </w:rPr>
+        <w:t>He started on a heartbeat. One. The air over the rise went the temperature of a held hand, even, no sheet, no column, no gold-spill into the sky. Two, three. Frost receded in a clean circle the size of the Kiln, not the size of ten streets, a mercy with an edge. Four, five. Orin made a sound that was almost a laugh. Lyra's seals ticked and did not scream. Six, seven, eight. The hunting party's steam became ordinary breath. A gauntlet dropped because the man inside it could feel his fingers and had forgotten they were his. Nine, ten. Rhel held the tablet like a rail. Eleven. Ren kept the noon on the crust and not in the men, not in the charms, not in the disk. A hearth. Twelve, thirteen. Cinder lay down in the circle as if someone had finally put a brick in the sun.</w:t>
+      </w:r>
+    </w:p>
+    <w:p>
+      <w:pPr>
+        <w:spacing w:line="360" w:lineRule="auto" w:after="160"/>
+        <w:ind w:firstLine="403"/>
+        <w:jc w:val="both"/>
+      </w:pPr>
+      <w:r>
+        <w:rPr>
+          <w:rFonts w:ascii="Garamond" w:hAnsi="Garamond" w:eastAsia="Garamond"/>
+          <w:b w:val="0"/>
+          <w:i w:val="0"/>
+          <w:color w:val="2A241C"/>
+          <w:sz w:val="22"/>
+        </w:rPr>
+        <w:t>Fourteen, fifteen, sixteen. The Hollow Sun sat over them, black, lid-light, and the stare from the tannery and the bronze room and the cracked crust was on the back of his neck, interested. He did not look up. Looking up was a push. Seventeen, eighteen. A purge-guard took a step into the circle, not attacking, the way the Stacks people had put their hands out in the thawed doorways, not quite daring to believe. Rhel shouted a form-code. The man did not come back. Nineteen, twenty. Ren's pulse wanted to run. He made it walk. The split ticked with it, rude, delighted, a dream being walked instead of rotting. Twenty-one. Lyra said, very low, "Don't get greedy." Twenty-two. He was not greedy. He was stubborn. They were neighbors, not friends.</w:t>
+      </w:r>
+    </w:p>
+    <w:p>
+      <w:pPr>
+        <w:spacing w:line="360" w:lineRule="auto" w:after="160"/>
+        <w:ind w:firstLine="403"/>
+        <w:jc w:val="both"/>
+      </w:pPr>
+      <w:r>
+        <w:rPr>
+          <w:rFonts w:ascii="Garamond" w:hAnsi="Garamond" w:eastAsia="Garamond"/>
+          <w:b w:val="0"/>
+          <w:i w:val="0"/>
+          <w:color w:val="2A241C"/>
+          <w:sz w:val="22"/>
+        </w:rPr>
+        <w:t>Twenty-three, twenty-four. He thought of Nima's yellow fingertips going pink. He thought of Lirae's closed door, which was not his to open. He thought of Sera looking at sabers, which was not his to undo. Twenty-five. The noon held. No overflow. No dominion-coin forcing a lock. A place. Twenty-six, twenty-seven. Rhel put the tablet away, which was the first intelligent thing the man had done since the loft. Twenty-eight. Ren felt the eye under the world's crust consider opening and he did not invite it. Twenty-nine. Cinder sneezed. Thirty.</w:t>
+      </w:r>
+    </w:p>
+    <w:p>
+      <w:pPr>
+        <w:spacing w:line="360" w:lineRule="auto" w:after="160"/>
+        <w:ind w:firstLine="403"/>
+        <w:jc w:val="both"/>
+      </w:pPr>
+      <w:r>
+        <w:rPr>
+          <w:rFonts w:ascii="Garamond" w:hAnsi="Garamond" w:eastAsia="Garamond"/>
+          <w:b w:val="0"/>
+          <w:i w:val="0"/>
+          <w:color w:val="2A241C"/>
+          <w:sz w:val="22"/>
+        </w:rPr>
+        <w:t>He stopped it. The circle went back to honest cold in a breath, rime racing in, the Kiln-sized mercy gone, the man who had stepped forward gasping at his own hands. No sag. No cooked squad. No net of light on ten streets. Thirty heartbeats of noon that had belonged to no one, and then a waste again, and the proof sitting on the rise like a bowl put down. Ren's knees wanted the crust. He did not give them that. He stood. The gold in his mouth was gone. The split ticked once more and then went to the low idle of a stove with the door shut.</w:t>
+      </w:r>
+    </w:p>
+    <w:p>
+      <w:pPr>
+        <w:spacing w:line="360" w:lineRule="auto" w:after="160"/>
+        <w:ind w:firstLine="403"/>
+        <w:jc w:val="both"/>
+      </w:pPr>
+      <w:r>
+        <w:rPr>
+          <w:rFonts w:ascii="Garamond" w:hAnsi="Garamond" w:eastAsia="Garamond"/>
+          <w:b w:val="0"/>
+          <w:i w:val="0"/>
+          <w:color w:val="2A241C"/>
+          <w:sz w:val="22"/>
+        </w:rPr>
+        <w:t>Above them the black disk twitched. Not a metaphor. Not a dream's private tic. The lid moved, a fraction, a hair, the first disagreement it had had with its own stillness in a thousand years, and the cold light on the rime shifted as if a lamp had been breathed on. Someone in the white line made a prayer and lost it. Orin said a word that was not tuition. Lyra did not look up, which was its own theology. She watched Rhel instead. Rhel watched the disk until watching became a problem he could not put on a tablet, and then he looked at the boy, and the look had no drawer left for the horror.</w:t>
+      </w:r>
+    </w:p>
+    <w:p>
+      <w:pPr>
+        <w:spacing w:line="360" w:lineRule="auto" w:after="160"/>
+        <w:ind w:firstLine="403"/>
+        <w:jc w:val="both"/>
+      </w:pPr>
+      <w:r>
+        <w:rPr>
+          <w:rFonts w:ascii="Garamond" w:hAnsi="Garamond" w:eastAsia="Garamond"/>
+          <w:b w:val="0"/>
+          <w:i w:val="0"/>
+          <w:color w:val="2A241C"/>
+          <w:sz w:val="22"/>
+        </w:rPr>
+        <w:t>Far behind, in Vireth, people would have seen it. Terrace windows. The Ember Court gallery. A girl in a Kiln, if she was looking, which she would be. The melt-band, the Wellgate's sag, the Saint in the inner court with a shard sewn over his heart: all of them under a lid that had just confessed it could move. Ren did not need to be there to know what the mouths would do with it. Dead, said the Church, before he taught the disk a worse trick. Bottled, said the houses, a well with feet is still a well, put a valve on it, walk him on feast days. Crowned, said the ones who had stood in a gold ring with their hands out, said the nightlands, said the part of a queen that wanted a hearth to stay. Three sermons. Same boy.</w:t>
+      </w:r>
+    </w:p>
+    <w:p>
+      <w:pPr>
+        <w:spacing w:line="360" w:lineRule="auto" w:after="160"/>
+        <w:ind w:firstLine="403"/>
+        <w:jc w:val="both"/>
+      </w:pPr>
+      <w:r>
+        <w:rPr>
+          <w:rFonts w:ascii="Garamond" w:hAnsi="Garamond" w:eastAsia="Garamond"/>
+          <w:b w:val="0"/>
+          <w:i w:val="0"/>
+          <w:color w:val="2A241C"/>
+          <w:sz w:val="22"/>
+        </w:rPr>
+        <w:t>"You will tell her," Ren said. He was shaking now that the count was over, which was allowed. "Dead. Bottled. Crowned. That's the three sermons. She can pick one and come try it. I am not going to stand in a cage and I am not going to put a lid on you and I am not going to let a god get up because I got curious. If she wants dusk she can keep her own. This was a place. People walked into it. People can walk out. That's the whole trick." He whistled, the slurred street-note. Cinder came, offended at being whistled for in front of Churchmen. The hunting party did not close. The null-charms hung like teeth that had lost the bite. Rhel raised a hand, not a form, a halt, and the white line held because the disk had moved and no primer covered that.</w:t>
+      </w:r>
+    </w:p>
+    <w:p>
+      <w:pPr>
+        <w:spacing w:line="360" w:lineRule="auto" w:after="160"/>
+        <w:ind w:firstLine="403"/>
+        <w:jc w:val="both"/>
+      </w:pPr>
+      <w:r>
+        <w:rPr>
+          <w:rFonts w:ascii="Garamond" w:hAnsi="Garamond" w:eastAsia="Garamond"/>
+          <w:b w:val="0"/>
+          <w:i w:val="0"/>
+          <w:color w:val="2A241C"/>
+          <w:sz w:val="22"/>
+        </w:rPr>
+        <w:t>They backed off the rise the way you backed off a well that had started looking back. Lyra did not lower the sabers until the last gauntlet was a smear of steam in the pale. Orin let Glassheart go and sat down hard on the crust and laughed the boot-coming-off laugh Toma had used in the cisterns, no humor, too much air. Mother Ash was in the rime at Ren's shoulder without having walked, ash-seamed, eyes dull red, the wolf bowing its long spine not to a king and not to a vessel, to a hearth that had started and stopped. "Kept," she said. "They will not keep it. The Church will want you out. The houses will want you in a box with a valve. My own, if I am not careful, will want a crown because a crown is a hearth that forgot how to be left. You will be all three in other people's mouths by night. Come in. Eat. The house does not nail. Tomorrow we will see if you can do it without a hunting party to count for."</w:t>
+      </w:r>
+    </w:p>
+    <w:p>
+      <w:pPr>
+        <w:spacing w:line="360" w:lineRule="auto" w:after="160"/>
+        <w:ind w:firstLine="403"/>
+        <w:jc w:val="both"/>
+      </w:pPr>
+      <w:r>
+        <w:rPr>
+          <w:rFonts w:ascii="Garamond" w:hAnsi="Garamond" w:eastAsia="Garamond"/>
+          <w:b w:val="0"/>
+          <w:i w:val="0"/>
+          <w:color w:val="2A241C"/>
+          <w:sz w:val="22"/>
+        </w:rPr>
+        <w:t>Ren looked at the disk until looking felt like a push, then looked away. Vireth was a smear of smoke on the far side of the waste, ten streets that would be white again, a Kiln with a nailed cloth, a girl who might still be keeping marks. He was seventeen and a problem with a dog and an oath and a noon the size of a room. The world wanted him dead, or bottled, or crowned. He put his palm on Cinder's skull and felt the three-legged engine going, stubborn as a grate-thief, and he went down the rise toward the ice-hall because the people he would not leave were going, and because a place you could walk away from was the only kind of sun he intended to be, and because the lid in the sky had moved, and someone, somewhere, was already writing a new psalm that he would not sign.</w:t>
       </w:r>
     </w:p>
     <w:sectPr>

</xml_diff>